<commit_message>
Add revert test comment
</commit_message>
<xml_diff>
--- a/Git-GitHub-Assignment_MSDSF26M012_MSDSF25A007.docx
+++ b/Git-GitHub-Assignment_MSDSF26M012_MSDSF25A007.docx
@@ -4949,8 +4949,6 @@
           </wp:inline>
         </w:drawing>
       </w:r>
-      <w:bookmarkStart w:id="0" w:name="_GoBack"/>
-      <w:bookmarkEnd w:id="0"/>
     </w:p>
     <w:p>
       <w:r>
@@ -5384,6 +5382,816 @@
         <w:t>Show stash, stash list, and stash pop evidence.</w:t>
       </w:r>
     </w:p>
+    <w:p>
+      <w:pPr>
+        <w:jc w:val="center"/>
+      </w:pPr>
+      <w:r>
+        <w:rPr>
+          <w:i/>
+        </w:rPr>
+        <w:drawing>
+          <wp:inline distT="0" distB="0" distL="0" distR="0" wp14:anchorId="4A653325" wp14:editId="18860B47">
+            <wp:extent cx="6858000" cy="4010025"/>
+            <wp:effectExtent l="0" t="0" r="0" b="9525"/>
+            <wp:docPr id="7" name="Picture 7"/>
+            <wp:cNvGraphicFramePr>
+              <a:graphicFrameLocks xmlns:a="http://schemas.openxmlformats.org/drawingml/2006/main" noChangeAspect="1"/>
+            </wp:cNvGraphicFramePr>
+            <a:graphic xmlns:a="http://schemas.openxmlformats.org/drawingml/2006/main">
+              <a:graphicData uri="http://schemas.openxmlformats.org/drawingml/2006/picture">
+                <pic:pic xmlns:pic="http://schemas.openxmlformats.org/drawingml/2006/picture">
+                  <pic:nvPicPr>
+                    <pic:cNvPr id="1" name=""/>
+                    <pic:cNvPicPr/>
+                  </pic:nvPicPr>
+                  <pic:blipFill>
+                    <a:blip r:embed="rId40"/>
+                    <a:stretch>
+                      <a:fillRect/>
+                    </a:stretch>
+                  </pic:blipFill>
+                  <pic:spPr>
+                    <a:xfrm>
+                      <a:off x="0" y="0"/>
+                      <a:ext cx="6858000" cy="4010025"/>
+                    </a:xfrm>
+                    <a:prstGeom prst="rect">
+                      <a:avLst/>
+                    </a:prstGeom>
+                  </pic:spPr>
+                </pic:pic>
+              </a:graphicData>
+            </a:graphic>
+          </wp:inline>
+        </w:drawing>
+      </w:r>
+      <w:r>
+        <w:rPr>
+          <w:i/>
+        </w:rPr>
+        <w:t xml:space="preserve">Figure 27: </w:t>
+      </w:r>
+      <w:proofErr w:type="spellStart"/>
+      <w:r>
+        <w:rPr>
+          <w:i/>
+        </w:rPr>
+        <w:t>Git</w:t>
+      </w:r>
+      <w:proofErr w:type="spellEnd"/>
+      <w:r>
+        <w:rPr>
+          <w:i/>
+        </w:rPr>
+        <w:t xml:space="preserve"> Stash.</w:t>
+      </w:r>
+    </w:p>
+    <w:p>
+      <w:r>
+        <w:rPr>
+          <w:b/>
+        </w:rPr>
+        <w:t>Questions / Explanation:</w:t>
+      </w:r>
+    </w:p>
+    <w:p>
+      <w:pPr>
+        <w:pStyle w:val="ListBullet"/>
+      </w:pPr>
+      <w:r>
+        <w:t xml:space="preserve">Why would a developer use </w:t>
+      </w:r>
+      <w:proofErr w:type="spellStart"/>
+      <w:r>
+        <w:t>git</w:t>
+      </w:r>
+      <w:proofErr w:type="spellEnd"/>
+      <w:r>
+        <w:t xml:space="preserve"> stash?</w:t>
+      </w:r>
+    </w:p>
+    <w:p>
+      <w:pPr>
+        <w:spacing w:before="100" w:beforeAutospacing="1" w:after="100" w:afterAutospacing="1" w:line="240" w:lineRule="auto"/>
+        <w:rPr>
+          <w:rFonts w:ascii="Times New Roman" w:eastAsia="Times New Roman" w:hAnsi="Times New Roman" w:cs="Times New Roman"/>
+          <w:sz w:val="24"/>
+          <w:szCs w:val="24"/>
+        </w:rPr>
+      </w:pPr>
+      <w:proofErr w:type="spellStart"/>
+      <w:proofErr w:type="gramStart"/>
+      <w:r>
+        <w:rPr>
+          <w:rFonts w:ascii="Courier New" w:eastAsia="Times New Roman" w:hAnsi="Courier New" w:cs="Courier New"/>
+          <w:sz w:val="20"/>
+          <w:szCs w:val="20"/>
+        </w:rPr>
+        <w:t>git</w:t>
+      </w:r>
+      <w:proofErr w:type="spellEnd"/>
+      <w:proofErr w:type="gramEnd"/>
+      <w:r>
+        <w:rPr>
+          <w:rFonts w:ascii="Courier New" w:eastAsia="Times New Roman" w:hAnsi="Courier New" w:cs="Courier New"/>
+          <w:sz w:val="20"/>
+          <w:szCs w:val="20"/>
+        </w:rPr>
+        <w:t xml:space="preserve"> stash</w:t>
+      </w:r>
+      <w:r>
+        <w:rPr>
+          <w:rFonts w:ascii="Times New Roman" w:eastAsia="Times New Roman" w:hAnsi="Times New Roman" w:cs="Times New Roman"/>
+          <w:sz w:val="24"/>
+          <w:szCs w:val="24"/>
+        </w:rPr>
+        <w:t xml:space="preserve"> temporarily stores uncommitted changes when switching branches or contexts without losing work. Use cases:</w:t>
+      </w:r>
+    </w:p>
+    <w:p>
+      <w:pPr>
+        <w:numPr>
+          <w:ilvl w:val="0"/>
+          <w:numId w:val="13"/>
+        </w:numPr>
+        <w:spacing w:before="100" w:beforeAutospacing="1" w:after="100" w:afterAutospacing="1" w:line="240" w:lineRule="auto"/>
+        <w:rPr>
+          <w:rFonts w:ascii="Times New Roman" w:eastAsia="Times New Roman" w:hAnsi="Times New Roman" w:cs="Times New Roman"/>
+          <w:sz w:val="24"/>
+          <w:szCs w:val="24"/>
+        </w:rPr>
+      </w:pPr>
+      <w:r>
+        <w:rPr>
+          <w:rFonts w:ascii="Times New Roman" w:eastAsia="Times New Roman" w:hAnsi="Times New Roman" w:cs="Times New Roman"/>
+          <w:sz w:val="24"/>
+          <w:szCs w:val="24"/>
+        </w:rPr>
+        <w:t>Switching branches mid-feature to fix an urgent bug</w:t>
+      </w:r>
+    </w:p>
+    <w:p>
+      <w:pPr>
+        <w:numPr>
+          <w:ilvl w:val="0"/>
+          <w:numId w:val="13"/>
+        </w:numPr>
+        <w:spacing w:before="100" w:beforeAutospacing="1" w:after="100" w:afterAutospacing="1" w:line="240" w:lineRule="auto"/>
+        <w:rPr>
+          <w:rFonts w:ascii="Times New Roman" w:eastAsia="Times New Roman" w:hAnsi="Times New Roman" w:cs="Times New Roman"/>
+          <w:sz w:val="24"/>
+          <w:szCs w:val="24"/>
+        </w:rPr>
+      </w:pPr>
+      <w:r>
+        <w:rPr>
+          <w:rFonts w:ascii="Times New Roman" w:eastAsia="Times New Roman" w:hAnsi="Times New Roman" w:cs="Times New Roman"/>
+          <w:sz w:val="24"/>
+          <w:szCs w:val="24"/>
+        </w:rPr>
+        <w:t>Pulling remote changes without committing incomplete work</w:t>
+      </w:r>
+    </w:p>
+    <w:p>
+      <w:pPr>
+        <w:numPr>
+          <w:ilvl w:val="0"/>
+          <w:numId w:val="13"/>
+        </w:numPr>
+        <w:spacing w:before="100" w:beforeAutospacing="1" w:after="100" w:afterAutospacing="1" w:line="240" w:lineRule="auto"/>
+        <w:rPr>
+          <w:rFonts w:ascii="Times New Roman" w:eastAsia="Times New Roman" w:hAnsi="Times New Roman" w:cs="Times New Roman"/>
+          <w:sz w:val="24"/>
+          <w:szCs w:val="24"/>
+        </w:rPr>
+      </w:pPr>
+      <w:r>
+        <w:rPr>
+          <w:rFonts w:ascii="Times New Roman" w:eastAsia="Times New Roman" w:hAnsi="Times New Roman" w:cs="Times New Roman"/>
+          <w:sz w:val="24"/>
+          <w:szCs w:val="24"/>
+        </w:rPr>
+        <w:t>Cleaning working directory without discarding progress</w:t>
+      </w:r>
+    </w:p>
+    <w:p>
+      <w:pPr>
+        <w:numPr>
+          <w:ilvl w:val="0"/>
+          <w:numId w:val="13"/>
+        </w:numPr>
+        <w:spacing w:before="100" w:beforeAutospacing="1" w:after="100" w:afterAutospacing="1" w:line="240" w:lineRule="auto"/>
+        <w:rPr>
+          <w:rFonts w:ascii="Times New Roman" w:eastAsia="Times New Roman" w:hAnsi="Times New Roman" w:cs="Times New Roman"/>
+          <w:sz w:val="24"/>
+          <w:szCs w:val="24"/>
+        </w:rPr>
+      </w:pPr>
+      <w:r>
+        <w:rPr>
+          <w:rFonts w:ascii="Times New Roman" w:eastAsia="Times New Roman" w:hAnsi="Times New Roman" w:cs="Times New Roman"/>
+          <w:sz w:val="24"/>
+          <w:szCs w:val="24"/>
+        </w:rPr>
+        <w:lastRenderedPageBreak/>
+        <w:t>Pausing work to review another developer's code</w:t>
+      </w:r>
+    </w:p>
+    <w:p>
+      <w:pPr>
+        <w:spacing w:before="100" w:beforeAutospacing="1" w:after="100" w:afterAutospacing="1" w:line="240" w:lineRule="auto"/>
+        <w:rPr>
+          <w:rFonts w:ascii="Times New Roman" w:eastAsia="Times New Roman" w:hAnsi="Times New Roman" w:cs="Times New Roman"/>
+          <w:sz w:val="24"/>
+          <w:szCs w:val="24"/>
+        </w:rPr>
+      </w:pPr>
+      <w:r>
+        <w:rPr>
+          <w:rFonts w:ascii="Times New Roman" w:eastAsia="Times New Roman" w:hAnsi="Times New Roman" w:cs="Times New Roman"/>
+          <w:b/>
+          <w:bCs/>
+          <w:sz w:val="24"/>
+          <w:szCs w:val="24"/>
+        </w:rPr>
+        <w:t>Industry practice:</w:t>
+      </w:r>
+      <w:r>
+        <w:rPr>
+          <w:rFonts w:ascii="Times New Roman" w:eastAsia="Times New Roman" w:hAnsi="Times New Roman" w:cs="Times New Roman"/>
+          <w:sz w:val="24"/>
+          <w:szCs w:val="24"/>
+        </w:rPr>
+        <w:t xml:space="preserve"> Developers stash when interrupted by higher-priority tasks; it's essential in interrupt-driven environments.</w:t>
+      </w:r>
+    </w:p>
+    <w:p>
+      <w:pPr>
+        <w:pStyle w:val="ListBullet"/>
+        <w:numPr>
+          <w:ilvl w:val="0"/>
+          <w:numId w:val="0"/>
+        </w:numPr>
+        <w:ind w:left="360"/>
+      </w:pPr>
+    </w:p>
+    <w:p>
+      <w:pPr>
+        <w:pStyle w:val="Heading2"/>
+      </w:pPr>
+      <w:r>
+        <w:t xml:space="preserve">Task 23 — Demonstrate </w:t>
+      </w:r>
+      <w:proofErr w:type="spellStart"/>
+      <w:r>
+        <w:t>Git</w:t>
+      </w:r>
+      <w:proofErr w:type="spellEnd"/>
+      <w:r>
+        <w:t xml:space="preserve"> Restore</w:t>
+      </w:r>
+    </w:p>
+    <w:p>
+      <w:r>
+        <w:t xml:space="preserve">Modify style.css, inspect the changes, </w:t>
+      </w:r>
+      <w:proofErr w:type="gramStart"/>
+      <w:r>
+        <w:t>then</w:t>
+      </w:r>
+      <w:proofErr w:type="gramEnd"/>
+      <w:r>
+        <w:t xml:space="preserve"> discard the uncommitted modification.</w:t>
+      </w:r>
+    </w:p>
+    <w:p>
+      <w:pPr>
+        <w:spacing w:before="60" w:after="100"/>
+        <w:ind w:left="360"/>
+      </w:pPr>
+      <w:proofErr w:type="spellStart"/>
+      <w:proofErr w:type="gramStart"/>
+      <w:r>
+        <w:rPr>
+          <w:rFonts w:ascii="Consolas" w:hAnsi="Consolas"/>
+          <w:sz w:val="18"/>
+        </w:rPr>
+        <w:t>git</w:t>
+      </w:r>
+      <w:proofErr w:type="spellEnd"/>
+      <w:proofErr w:type="gramEnd"/>
+      <w:r>
+        <w:rPr>
+          <w:rFonts w:ascii="Consolas" w:hAnsi="Consolas"/>
+          <w:sz w:val="18"/>
+        </w:rPr>
+        <w:t xml:space="preserve"> diff</w:t>
+      </w:r>
+      <w:r>
+        <w:rPr>
+          <w:rFonts w:ascii="Consolas" w:hAnsi="Consolas"/>
+          <w:sz w:val="18"/>
+        </w:rPr>
+        <w:br/>
+      </w:r>
+      <w:proofErr w:type="spellStart"/>
+      <w:r>
+        <w:rPr>
+          <w:rFonts w:ascii="Consolas" w:hAnsi="Consolas"/>
+          <w:sz w:val="18"/>
+        </w:rPr>
+        <w:t>git</w:t>
+      </w:r>
+      <w:proofErr w:type="spellEnd"/>
+      <w:r>
+        <w:rPr>
+          <w:rFonts w:ascii="Consolas" w:hAnsi="Consolas"/>
+          <w:sz w:val="18"/>
+        </w:rPr>
+        <w:t xml:space="preserve"> restore style.css</w:t>
+      </w:r>
+      <w:r>
+        <w:rPr>
+          <w:rFonts w:ascii="Consolas" w:hAnsi="Consolas"/>
+          <w:sz w:val="18"/>
+        </w:rPr>
+        <w:br/>
+      </w:r>
+      <w:proofErr w:type="spellStart"/>
+      <w:r>
+        <w:rPr>
+          <w:rFonts w:ascii="Consolas" w:hAnsi="Consolas"/>
+          <w:sz w:val="18"/>
+        </w:rPr>
+        <w:t>git</w:t>
+      </w:r>
+      <w:proofErr w:type="spellEnd"/>
+      <w:r>
+        <w:rPr>
+          <w:rFonts w:ascii="Consolas" w:hAnsi="Consolas"/>
+          <w:sz w:val="18"/>
+        </w:rPr>
+        <w:t xml:space="preserve"> status</w:t>
+      </w:r>
+    </w:p>
+    <w:p>
+      <w:r>
+        <w:rPr>
+          <w:b/>
+        </w:rPr>
+        <w:t xml:space="preserve">📸 Screenshot 28 — </w:t>
+      </w:r>
+      <w:proofErr w:type="spellStart"/>
+      <w:r>
+        <w:rPr>
+          <w:b/>
+        </w:rPr>
+        <w:t>Git</w:t>
+      </w:r>
+      <w:proofErr w:type="spellEnd"/>
+      <w:r>
+        <w:rPr>
+          <w:b/>
+        </w:rPr>
+        <w:t xml:space="preserve"> Restore</w:t>
+      </w:r>
+    </w:p>
+    <w:p>
+      <w:r>
+        <w:t>Show the change before restore and clean status afterward.</w:t>
+      </w:r>
+    </w:p>
+    <w:p>
+      <w:pPr>
+        <w:jc w:val="center"/>
+      </w:pPr>
+      <w:r>
+        <w:rPr>
+          <w:i/>
+        </w:rPr>
+        <w:lastRenderedPageBreak/>
+        <w:drawing>
+          <wp:inline distT="0" distB="0" distL="0" distR="0" wp14:anchorId="121F5853" wp14:editId="1DCD5298">
+            <wp:extent cx="6858000" cy="8036560"/>
+            <wp:effectExtent l="0" t="0" r="0" b="2540"/>
+            <wp:docPr id="21" name="Picture 21"/>
+            <wp:cNvGraphicFramePr>
+              <a:graphicFrameLocks xmlns:a="http://schemas.openxmlformats.org/drawingml/2006/main" noChangeAspect="1"/>
+            </wp:cNvGraphicFramePr>
+            <a:graphic xmlns:a="http://schemas.openxmlformats.org/drawingml/2006/main">
+              <a:graphicData uri="http://schemas.openxmlformats.org/drawingml/2006/picture">
+                <pic:pic xmlns:pic="http://schemas.openxmlformats.org/drawingml/2006/picture">
+                  <pic:nvPicPr>
+                    <pic:cNvPr id="1" name=""/>
+                    <pic:cNvPicPr/>
+                  </pic:nvPicPr>
+                  <pic:blipFill>
+                    <a:blip r:embed="rId41"/>
+                    <a:stretch>
+                      <a:fillRect/>
+                    </a:stretch>
+                  </pic:blipFill>
+                  <pic:spPr>
+                    <a:xfrm>
+                      <a:off x="0" y="0"/>
+                      <a:ext cx="6858000" cy="8036560"/>
+                    </a:xfrm>
+                    <a:prstGeom prst="rect">
+                      <a:avLst/>
+                    </a:prstGeom>
+                  </pic:spPr>
+                </pic:pic>
+              </a:graphicData>
+            </a:graphic>
+          </wp:inline>
+        </w:drawing>
+      </w:r>
+      <w:bookmarkStart w:id="0" w:name="_GoBack"/>
+      <w:bookmarkEnd w:id="0"/>
+      <w:r>
+        <w:rPr>
+          <w:i/>
+        </w:rPr>
+        <w:t xml:space="preserve">Figure 28: </w:t>
+      </w:r>
+      <w:proofErr w:type="spellStart"/>
+      <w:r>
+        <w:rPr>
+          <w:i/>
+        </w:rPr>
+        <w:t>Git</w:t>
+      </w:r>
+      <w:proofErr w:type="spellEnd"/>
+      <w:r>
+        <w:rPr>
+          <w:i/>
+        </w:rPr>
+        <w:t xml:space="preserve"> Restore.</w:t>
+      </w:r>
+    </w:p>
+    <w:p>
+      <w:r>
+        <w:rPr>
+          <w:b/>
+        </w:rPr>
+        <w:t>Questions / Explanation:</w:t>
+      </w:r>
+    </w:p>
+    <w:p>
+      <w:pPr>
+        <w:pStyle w:val="ListBullet"/>
+      </w:pPr>
+      <w:r>
+        <w:t>What happened to the uncommitted modification?</w:t>
+      </w:r>
+    </w:p>
+    <w:p>
+      <w:pPr>
+        <w:spacing w:before="100" w:beforeAutospacing="1" w:after="100" w:afterAutospacing="1" w:line="240" w:lineRule="auto"/>
+        <w:rPr>
+          <w:rFonts w:ascii="Times New Roman" w:eastAsia="Times New Roman" w:hAnsi="Times New Roman" w:cs="Times New Roman"/>
+          <w:sz w:val="24"/>
+          <w:szCs w:val="24"/>
+        </w:rPr>
+      </w:pPr>
+      <w:r>
+        <w:rPr>
+          <w:rFonts w:ascii="Times New Roman" w:eastAsia="Times New Roman" w:hAnsi="Times New Roman" w:cs="Times New Roman"/>
+          <w:sz w:val="24"/>
+          <w:szCs w:val="24"/>
+        </w:rPr>
+        <w:lastRenderedPageBreak/>
+        <w:t xml:space="preserve">When using </w:t>
+      </w:r>
+      <w:proofErr w:type="spellStart"/>
+      <w:r>
+        <w:rPr>
+          <w:rFonts w:ascii="Courier New" w:eastAsia="Times New Roman" w:hAnsi="Courier New" w:cs="Courier New"/>
+          <w:sz w:val="20"/>
+          <w:szCs w:val="20"/>
+        </w:rPr>
+        <w:t>git</w:t>
+      </w:r>
+      <w:proofErr w:type="spellEnd"/>
+      <w:r>
+        <w:rPr>
+          <w:rFonts w:ascii="Courier New" w:eastAsia="Times New Roman" w:hAnsi="Courier New" w:cs="Courier New"/>
+          <w:sz w:val="20"/>
+          <w:szCs w:val="20"/>
+        </w:rPr>
+        <w:t xml:space="preserve"> restore &lt;file&gt;</w:t>
+      </w:r>
+      <w:r>
+        <w:rPr>
+          <w:rFonts w:ascii="Times New Roman" w:eastAsia="Times New Roman" w:hAnsi="Times New Roman" w:cs="Times New Roman"/>
+          <w:sz w:val="24"/>
+          <w:szCs w:val="24"/>
+        </w:rPr>
+        <w:t>:</w:t>
+      </w:r>
+    </w:p>
+    <w:p>
+      <w:pPr>
+        <w:numPr>
+          <w:ilvl w:val="0"/>
+          <w:numId w:val="14"/>
+        </w:numPr>
+        <w:spacing w:before="100" w:beforeAutospacing="1" w:after="100" w:afterAutospacing="1" w:line="240" w:lineRule="auto"/>
+        <w:rPr>
+          <w:rFonts w:ascii="Times New Roman" w:eastAsia="Times New Roman" w:hAnsi="Times New Roman" w:cs="Times New Roman"/>
+          <w:sz w:val="24"/>
+          <w:szCs w:val="24"/>
+        </w:rPr>
+      </w:pPr>
+      <w:r>
+        <w:rPr>
+          <w:rFonts w:ascii="Times New Roman" w:eastAsia="Times New Roman" w:hAnsi="Times New Roman" w:cs="Times New Roman"/>
+          <w:sz w:val="24"/>
+          <w:szCs w:val="24"/>
+        </w:rPr>
+        <w:t xml:space="preserve">The </w:t>
+      </w:r>
+      <w:r>
+        <w:rPr>
+          <w:rFonts w:ascii="Times New Roman" w:eastAsia="Times New Roman" w:hAnsi="Times New Roman" w:cs="Times New Roman"/>
+          <w:b/>
+          <w:bCs/>
+          <w:sz w:val="24"/>
+          <w:szCs w:val="24"/>
+        </w:rPr>
+        <w:t>uncommitted changes are permanently discarded</w:t>
+      </w:r>
+    </w:p>
+    <w:p>
+      <w:pPr>
+        <w:numPr>
+          <w:ilvl w:val="0"/>
+          <w:numId w:val="14"/>
+        </w:numPr>
+        <w:spacing w:before="100" w:beforeAutospacing="1" w:after="100" w:afterAutospacing="1" w:line="240" w:lineRule="auto"/>
+        <w:rPr>
+          <w:rFonts w:ascii="Times New Roman" w:eastAsia="Times New Roman" w:hAnsi="Times New Roman" w:cs="Times New Roman"/>
+          <w:sz w:val="24"/>
+          <w:szCs w:val="24"/>
+        </w:rPr>
+      </w:pPr>
+      <w:r>
+        <w:rPr>
+          <w:rFonts w:ascii="Times New Roman" w:eastAsia="Times New Roman" w:hAnsi="Times New Roman" w:cs="Times New Roman"/>
+          <w:sz w:val="24"/>
+          <w:szCs w:val="24"/>
+        </w:rPr>
+        <w:t>Working directory reverts to the last committed state</w:t>
+      </w:r>
+    </w:p>
+    <w:p>
+      <w:pPr>
+        <w:numPr>
+          <w:ilvl w:val="0"/>
+          <w:numId w:val="14"/>
+        </w:numPr>
+        <w:spacing w:before="100" w:beforeAutospacing="1" w:after="100" w:afterAutospacing="1" w:line="240" w:lineRule="auto"/>
+        <w:rPr>
+          <w:rFonts w:ascii="Times New Roman" w:eastAsia="Times New Roman" w:hAnsi="Times New Roman" w:cs="Times New Roman"/>
+          <w:sz w:val="24"/>
+          <w:szCs w:val="24"/>
+        </w:rPr>
+      </w:pPr>
+      <w:r>
+        <w:rPr>
+          <w:rFonts w:ascii="Times New Roman" w:eastAsia="Times New Roman" w:hAnsi="Times New Roman" w:cs="Times New Roman"/>
+          <w:sz w:val="24"/>
+          <w:szCs w:val="24"/>
+        </w:rPr>
+        <w:t xml:space="preserve">Changes are </w:t>
+      </w:r>
+      <w:r>
+        <w:rPr>
+          <w:rFonts w:ascii="Times New Roman" w:eastAsia="Times New Roman" w:hAnsi="Times New Roman" w:cs="Times New Roman"/>
+          <w:b/>
+          <w:bCs/>
+          <w:sz w:val="24"/>
+          <w:szCs w:val="24"/>
+        </w:rPr>
+        <w:t>not recoverable</w:t>
+      </w:r>
+      <w:r>
+        <w:rPr>
+          <w:rFonts w:ascii="Times New Roman" w:eastAsia="Times New Roman" w:hAnsi="Times New Roman" w:cs="Times New Roman"/>
+          <w:sz w:val="24"/>
+          <w:szCs w:val="24"/>
+        </w:rPr>
+        <w:t xml:space="preserve"> (unless previously stashed)</w:t>
+      </w:r>
+    </w:p>
+    <w:p>
+      <w:pPr>
+        <w:numPr>
+          <w:ilvl w:val="0"/>
+          <w:numId w:val="14"/>
+        </w:numPr>
+        <w:spacing w:before="100" w:beforeAutospacing="1" w:after="100" w:afterAutospacing="1" w:line="240" w:lineRule="auto"/>
+        <w:rPr>
+          <w:rFonts w:ascii="Times New Roman" w:eastAsia="Times New Roman" w:hAnsi="Times New Roman" w:cs="Times New Roman"/>
+          <w:sz w:val="24"/>
+          <w:szCs w:val="24"/>
+        </w:rPr>
+      </w:pPr>
+      <w:r>
+        <w:rPr>
+          <w:rFonts w:ascii="Times New Roman" w:eastAsia="Times New Roman" w:hAnsi="Times New Roman" w:cs="Times New Roman"/>
+          <w:sz w:val="24"/>
+          <w:szCs w:val="24"/>
+        </w:rPr>
+        <w:t>This is irreversible, so it should only be used when intentionally abandoning changes</w:t>
+      </w:r>
+    </w:p>
+    <w:p>
+      <w:pPr>
+        <w:pStyle w:val="ListBullet"/>
+        <w:numPr>
+          <w:ilvl w:val="0"/>
+          <w:numId w:val="0"/>
+        </w:numPr>
+        <w:ind w:left="360"/>
+      </w:pPr>
+    </w:p>
+    <w:p>
+      <w:pPr>
+        <w:pStyle w:val="Heading2"/>
+      </w:pPr>
+      <w:r>
+        <w:t xml:space="preserve">Task 24 — Demonstrate </w:t>
+      </w:r>
+      <w:proofErr w:type="spellStart"/>
+      <w:r>
+        <w:t>Git</w:t>
+      </w:r>
+      <w:proofErr w:type="spellEnd"/>
+      <w:r>
+        <w:t xml:space="preserve"> Reset</w:t>
+      </w:r>
+    </w:p>
+    <w:p>
+      <w:r>
+        <w:t>Create a temporary commit and then use a soft reset to remove the commit while keeping the changes staged.</w:t>
+      </w:r>
+    </w:p>
+    <w:p>
+      <w:pPr>
+        <w:spacing w:before="60" w:after="100"/>
+        <w:ind w:left="360"/>
+      </w:pPr>
+      <w:proofErr w:type="spellStart"/>
+      <w:proofErr w:type="gramStart"/>
+      <w:r>
+        <w:rPr>
+          <w:rFonts w:ascii="Consolas" w:hAnsi="Consolas"/>
+          <w:sz w:val="18"/>
+        </w:rPr>
+        <w:t>git</w:t>
+      </w:r>
+      <w:proofErr w:type="spellEnd"/>
+      <w:proofErr w:type="gramEnd"/>
+      <w:r>
+        <w:rPr>
+          <w:rFonts w:ascii="Consolas" w:hAnsi="Consolas"/>
+          <w:sz w:val="18"/>
+        </w:rPr>
+        <w:t xml:space="preserve"> add .</w:t>
+      </w:r>
+      <w:r>
+        <w:rPr>
+          <w:rFonts w:ascii="Consolas" w:hAnsi="Consolas"/>
+          <w:sz w:val="18"/>
+        </w:rPr>
+        <w:br/>
+      </w:r>
+      <w:proofErr w:type="spellStart"/>
+      <w:proofErr w:type="gramStart"/>
+      <w:r>
+        <w:rPr>
+          <w:rFonts w:ascii="Consolas" w:hAnsi="Consolas"/>
+          <w:sz w:val="18"/>
+        </w:rPr>
+        <w:t>git</w:t>
+      </w:r>
+      <w:proofErr w:type="spellEnd"/>
+      <w:proofErr w:type="gramEnd"/>
+      <w:r>
+        <w:rPr>
+          <w:rFonts w:ascii="Consolas" w:hAnsi="Consolas"/>
+          <w:sz w:val="18"/>
+        </w:rPr>
+        <w:t xml:space="preserve"> commit -m "Temporary test commit"</w:t>
+      </w:r>
+      <w:r>
+        <w:rPr>
+          <w:rFonts w:ascii="Consolas" w:hAnsi="Consolas"/>
+          <w:sz w:val="18"/>
+        </w:rPr>
+        <w:br/>
+      </w:r>
+      <w:proofErr w:type="spellStart"/>
+      <w:r>
+        <w:rPr>
+          <w:rFonts w:ascii="Consolas" w:hAnsi="Consolas"/>
+          <w:sz w:val="18"/>
+        </w:rPr>
+        <w:t>git</w:t>
+      </w:r>
+      <w:proofErr w:type="spellEnd"/>
+      <w:r>
+        <w:rPr>
+          <w:rFonts w:ascii="Consolas" w:hAnsi="Consolas"/>
+          <w:sz w:val="18"/>
+        </w:rPr>
+        <w:t xml:space="preserve"> log --</w:t>
+      </w:r>
+      <w:proofErr w:type="spellStart"/>
+      <w:r>
+        <w:rPr>
+          <w:rFonts w:ascii="Consolas" w:hAnsi="Consolas"/>
+          <w:sz w:val="18"/>
+        </w:rPr>
+        <w:t>oneline</w:t>
+      </w:r>
+      <w:proofErr w:type="spellEnd"/>
+      <w:r>
+        <w:rPr>
+          <w:rFonts w:ascii="Consolas" w:hAnsi="Consolas"/>
+          <w:sz w:val="18"/>
+        </w:rPr>
+        <w:br/>
+      </w:r>
+      <w:proofErr w:type="spellStart"/>
+      <w:r>
+        <w:rPr>
+          <w:rFonts w:ascii="Consolas" w:hAnsi="Consolas"/>
+          <w:sz w:val="18"/>
+        </w:rPr>
+        <w:t>git</w:t>
+      </w:r>
+      <w:proofErr w:type="spellEnd"/>
+      <w:r>
+        <w:rPr>
+          <w:rFonts w:ascii="Consolas" w:hAnsi="Consolas"/>
+          <w:sz w:val="18"/>
+        </w:rPr>
+        <w:t xml:space="preserve"> reset --soft HEAD~1</w:t>
+      </w:r>
+      <w:r>
+        <w:rPr>
+          <w:rFonts w:ascii="Consolas" w:hAnsi="Consolas"/>
+          <w:sz w:val="18"/>
+        </w:rPr>
+        <w:br/>
+      </w:r>
+      <w:proofErr w:type="spellStart"/>
+      <w:r>
+        <w:rPr>
+          <w:rFonts w:ascii="Consolas" w:hAnsi="Consolas"/>
+          <w:sz w:val="18"/>
+        </w:rPr>
+        <w:t>git</w:t>
+      </w:r>
+      <w:proofErr w:type="spellEnd"/>
+      <w:r>
+        <w:rPr>
+          <w:rFonts w:ascii="Consolas" w:hAnsi="Consolas"/>
+          <w:sz w:val="18"/>
+        </w:rPr>
+        <w:t xml:space="preserve"> status</w:t>
+      </w:r>
+    </w:p>
+    <w:p>
+      <w:r>
+        <w:rPr>
+          <w:b/>
+        </w:rPr>
+        <w:t xml:space="preserve">📸 Screenshot 29 — </w:t>
+      </w:r>
+      <w:proofErr w:type="spellStart"/>
+      <w:r>
+        <w:rPr>
+          <w:b/>
+        </w:rPr>
+        <w:t>Git</w:t>
+      </w:r>
+      <w:proofErr w:type="spellEnd"/>
+      <w:r>
+        <w:rPr>
+          <w:b/>
+        </w:rPr>
+        <w:t xml:space="preserve"> Reset</w:t>
+      </w:r>
+    </w:p>
+    <w:p>
+      <w:r>
+        <w:t>Show the temporary commit and the result of the soft reset.</w:t>
+      </w:r>
+    </w:p>
     <w:tbl>
       <w:tblPr>
         <w:tblW w:w="0" w:type="auto"/>
@@ -5410,7 +6218,7 @@
               <w:rPr>
                 <w:sz w:val="18"/>
               </w:rPr>
-              <w:t>[Insert Screenshot 27 here]</w:t>
+              <w:t>[Insert Screenshot 29 here]</w:t>
             </w:r>
             <w:r>
               <w:rPr>
@@ -5437,7 +6245,7 @@
         <w:rPr>
           <w:i/>
         </w:rPr>
-        <w:t xml:space="preserve">Figure 27: </w:t>
+        <w:t xml:space="preserve">Figure 29: </w:t>
       </w:r>
       <w:proofErr w:type="spellStart"/>
       <w:r>
@@ -5451,7 +6259,7 @@
         <w:rPr>
           <w:i/>
         </w:rPr>
-        <w:t xml:space="preserve"> Stash.</w:t>
+        <w:t xml:space="preserve"> Reset.</w:t>
       </w:r>
     </w:p>
     <w:p>
@@ -5467,15 +6275,7 @@
         <w:pStyle w:val="ListBullet"/>
       </w:pPr>
       <w:r>
-        <w:t xml:space="preserve">Why would a developer use </w:t>
-      </w:r>
-      <w:proofErr w:type="spellStart"/>
-      <w:r>
-        <w:t>git</w:t>
-      </w:r>
-      <w:proofErr w:type="spellEnd"/>
-      <w:r>
-        <w:t xml:space="preserve"> stash?</w:t>
+        <w:t>What happened to the commit?</w:t>
       </w:r>
     </w:p>
     <w:p>
@@ -5487,8 +6287,15 @@
           <w:szCs w:val="24"/>
         </w:rPr>
       </w:pPr>
+      <w:r>
+        <w:rPr>
+          <w:rFonts w:ascii="Times New Roman" w:eastAsia="Times New Roman" w:hAnsi="Times New Roman" w:cs="Times New Roman"/>
+          <w:sz w:val="24"/>
+          <w:szCs w:val="24"/>
+        </w:rPr>
+        <w:t xml:space="preserve">With </w:t>
+      </w:r>
       <w:proofErr w:type="spellStart"/>
-      <w:proofErr w:type="gramStart"/>
       <w:r>
         <w:rPr>
           <w:rFonts w:ascii="Courier New" w:eastAsia="Times New Roman" w:hAnsi="Courier New" w:cs="Courier New"/>
@@ -5498,14 +6305,13 @@
         <w:t>git</w:t>
       </w:r>
       <w:proofErr w:type="spellEnd"/>
-      <w:proofErr w:type="gramEnd"/>
       <w:r>
         <w:rPr>
           <w:rFonts w:ascii="Courier New" w:eastAsia="Times New Roman" w:hAnsi="Courier New" w:cs="Courier New"/>
           <w:sz w:val="20"/>
           <w:szCs w:val="20"/>
         </w:rPr>
-        <w:t xml:space="preserve"> stash</w:t>
+        <w:t xml:space="preserve"> reset --soft HEAD~1</w:t>
       </w:r>
       <w:r>
         <w:rPr>
@@ -5513,14 +6319,14 @@
           <w:sz w:val="24"/>
           <w:szCs w:val="24"/>
         </w:rPr>
-        <w:t xml:space="preserve"> temporarily stores uncommitted changes when switching branches or contexts without losing work. Use cases:</w:t>
+        <w:t>:</w:t>
       </w:r>
     </w:p>
     <w:p>
       <w:pPr>
         <w:numPr>
           <w:ilvl w:val="0"/>
-          <w:numId w:val="13"/>
+          <w:numId w:val="15"/>
         </w:numPr>
         <w:spacing w:before="100" w:beforeAutospacing="1" w:after="100" w:afterAutospacing="1" w:line="240" w:lineRule="auto"/>
         <w:rPr>
@@ -5535,84 +6341,8 @@
           <w:sz w:val="24"/>
           <w:szCs w:val="24"/>
         </w:rPr>
-        <w:t>Switching branches mid-feature to fix an urgent bug</w:t>
-      </w:r>
-    </w:p>
-    <w:p>
-      <w:pPr>
-        <w:numPr>
-          <w:ilvl w:val="0"/>
-          <w:numId w:val="13"/>
-        </w:numPr>
-        <w:spacing w:before="100" w:beforeAutospacing="1" w:after="100" w:afterAutospacing="1" w:line="240" w:lineRule="auto"/>
-        <w:rPr>
-          <w:rFonts w:ascii="Times New Roman" w:eastAsia="Times New Roman" w:hAnsi="Times New Roman" w:cs="Times New Roman"/>
-          <w:sz w:val="24"/>
-          <w:szCs w:val="24"/>
-        </w:rPr>
-      </w:pPr>
-      <w:r>
-        <w:rPr>
-          <w:rFonts w:ascii="Times New Roman" w:eastAsia="Times New Roman" w:hAnsi="Times New Roman" w:cs="Times New Roman"/>
-          <w:sz w:val="24"/>
-          <w:szCs w:val="24"/>
-        </w:rPr>
-        <w:t>Pulling remote changes without committing incomplete work</w:t>
-      </w:r>
-    </w:p>
-    <w:p>
-      <w:pPr>
-        <w:numPr>
-          <w:ilvl w:val="0"/>
-          <w:numId w:val="13"/>
-        </w:numPr>
-        <w:spacing w:before="100" w:beforeAutospacing="1" w:after="100" w:afterAutospacing="1" w:line="240" w:lineRule="auto"/>
-        <w:rPr>
-          <w:rFonts w:ascii="Times New Roman" w:eastAsia="Times New Roman" w:hAnsi="Times New Roman" w:cs="Times New Roman"/>
-          <w:sz w:val="24"/>
-          <w:szCs w:val="24"/>
-        </w:rPr>
-      </w:pPr>
-      <w:r>
-        <w:rPr>
-          <w:rFonts w:ascii="Times New Roman" w:eastAsia="Times New Roman" w:hAnsi="Times New Roman" w:cs="Times New Roman"/>
-          <w:sz w:val="24"/>
-          <w:szCs w:val="24"/>
-        </w:rPr>
-        <w:t>Cleaning working directory without discarding progress</w:t>
-      </w:r>
-    </w:p>
-    <w:p>
-      <w:pPr>
-        <w:numPr>
-          <w:ilvl w:val="0"/>
-          <w:numId w:val="13"/>
-        </w:numPr>
-        <w:spacing w:before="100" w:beforeAutospacing="1" w:after="100" w:afterAutospacing="1" w:line="240" w:lineRule="auto"/>
-        <w:rPr>
-          <w:rFonts w:ascii="Times New Roman" w:eastAsia="Times New Roman" w:hAnsi="Times New Roman" w:cs="Times New Roman"/>
-          <w:sz w:val="24"/>
-          <w:szCs w:val="24"/>
-        </w:rPr>
-      </w:pPr>
-      <w:r>
-        <w:rPr>
-          <w:rFonts w:ascii="Times New Roman" w:eastAsia="Times New Roman" w:hAnsi="Times New Roman" w:cs="Times New Roman"/>
-          <w:sz w:val="24"/>
-          <w:szCs w:val="24"/>
-        </w:rPr>
-        <w:t>Pausing work to review another developer's code</w:t>
-      </w:r>
-    </w:p>
-    <w:p>
-      <w:pPr>
-        <w:spacing w:before="100" w:beforeAutospacing="1" w:after="100" w:afterAutospacing="1" w:line="240" w:lineRule="auto"/>
-        <w:rPr>
-          <w:rFonts w:ascii="Times New Roman" w:eastAsia="Times New Roman" w:hAnsi="Times New Roman" w:cs="Times New Roman"/>
-          <w:sz w:val="24"/>
-          <w:szCs w:val="24"/>
-        </w:rPr>
-      </w:pPr>
+        <w:t xml:space="preserve">The </w:t>
+      </w:r>
       <w:r>
         <w:rPr>
           <w:rFonts w:ascii="Times New Roman" w:eastAsia="Times New Roman" w:hAnsi="Times New Roman" w:cs="Times New Roman"/>
@@ -5621,7 +6351,7 @@
           <w:sz w:val="24"/>
           <w:szCs w:val="24"/>
         </w:rPr>
-        <w:t>Industry practice:</w:t>
+        <w:t>commit is removed</w:t>
       </w:r>
       <w:r>
         <w:rPr>
@@ -5629,7 +6359,141 @@
           <w:sz w:val="24"/>
           <w:szCs w:val="24"/>
         </w:rPr>
-        <w:t xml:space="preserve"> Developers stash when interrupted by higher-priority tasks; it's essential in interrupt-driven environments.</w:t>
+        <w:t xml:space="preserve"> and HEAD pointer moves back one commit</w:t>
+      </w:r>
+    </w:p>
+    <w:p>
+      <w:pPr>
+        <w:numPr>
+          <w:ilvl w:val="0"/>
+          <w:numId w:val="15"/>
+        </w:numPr>
+        <w:spacing w:before="100" w:beforeAutospacing="1" w:after="100" w:afterAutospacing="1" w:line="240" w:lineRule="auto"/>
+        <w:rPr>
+          <w:rFonts w:ascii="Times New Roman" w:eastAsia="Times New Roman" w:hAnsi="Times New Roman" w:cs="Times New Roman"/>
+          <w:sz w:val="24"/>
+          <w:szCs w:val="24"/>
+        </w:rPr>
+      </w:pPr>
+      <w:r>
+        <w:rPr>
+          <w:rFonts w:ascii="Times New Roman" w:eastAsia="Times New Roman" w:hAnsi="Times New Roman" w:cs="Times New Roman"/>
+          <w:sz w:val="24"/>
+          <w:szCs w:val="24"/>
+        </w:rPr>
+        <w:t xml:space="preserve">The </w:t>
+      </w:r>
+      <w:r>
+        <w:rPr>
+          <w:rFonts w:ascii="Courier New" w:eastAsia="Times New Roman" w:hAnsi="Courier New" w:cs="Courier New"/>
+          <w:sz w:val="20"/>
+          <w:szCs w:val="20"/>
+        </w:rPr>
+        <w:t>--soft</w:t>
+      </w:r>
+      <w:r>
+        <w:rPr>
+          <w:rFonts w:ascii="Times New Roman" w:eastAsia="Times New Roman" w:hAnsi="Times New Roman" w:cs="Times New Roman"/>
+          <w:sz w:val="24"/>
+          <w:szCs w:val="24"/>
+        </w:rPr>
+        <w:t xml:space="preserve"> flag is critical: </w:t>
+      </w:r>
+      <w:r>
+        <w:rPr>
+          <w:rFonts w:ascii="Times New Roman" w:eastAsia="Times New Roman" w:hAnsi="Times New Roman" w:cs="Times New Roman"/>
+          <w:b/>
+          <w:bCs/>
+          <w:sz w:val="24"/>
+          <w:szCs w:val="24"/>
+        </w:rPr>
+        <w:t>changes remain staged</w:t>
+      </w:r>
+      <w:r>
+        <w:rPr>
+          <w:rFonts w:ascii="Times New Roman" w:eastAsia="Times New Roman" w:hAnsi="Times New Roman" w:cs="Times New Roman"/>
+          <w:sz w:val="24"/>
+          <w:szCs w:val="24"/>
+        </w:rPr>
+        <w:t xml:space="preserve"> in the index</w:t>
+      </w:r>
+    </w:p>
+    <w:p>
+      <w:pPr>
+        <w:numPr>
+          <w:ilvl w:val="0"/>
+          <w:numId w:val="15"/>
+        </w:numPr>
+        <w:spacing w:before="100" w:beforeAutospacing="1" w:after="100" w:afterAutospacing="1" w:line="240" w:lineRule="auto"/>
+        <w:rPr>
+          <w:rFonts w:ascii="Times New Roman" w:eastAsia="Times New Roman" w:hAnsi="Times New Roman" w:cs="Times New Roman"/>
+          <w:sz w:val="24"/>
+          <w:szCs w:val="24"/>
+        </w:rPr>
+      </w:pPr>
+      <w:r>
+        <w:rPr>
+          <w:rFonts w:ascii="Times New Roman" w:eastAsia="Times New Roman" w:hAnsi="Times New Roman" w:cs="Times New Roman"/>
+          <w:sz w:val="24"/>
+          <w:szCs w:val="24"/>
+        </w:rPr>
+        <w:t xml:space="preserve">Changes are </w:t>
+      </w:r>
+      <w:r>
+        <w:rPr>
+          <w:rFonts w:ascii="Times New Roman" w:eastAsia="Times New Roman" w:hAnsi="Times New Roman" w:cs="Times New Roman"/>
+          <w:b/>
+          <w:bCs/>
+          <w:sz w:val="24"/>
+          <w:szCs w:val="24"/>
+        </w:rPr>
+        <w:t>not lost</w:t>
+      </w:r>
+      <w:r>
+        <w:rPr>
+          <w:rFonts w:ascii="Times New Roman" w:eastAsia="Times New Roman" w:hAnsi="Times New Roman" w:cs="Times New Roman"/>
+          <w:sz w:val="24"/>
+          <w:szCs w:val="24"/>
+        </w:rPr>
+        <w:t>—they stay in the staging area ready for re-commit</w:t>
+      </w:r>
+    </w:p>
+    <w:p>
+      <w:pPr>
+        <w:numPr>
+          <w:ilvl w:val="0"/>
+          <w:numId w:val="15"/>
+        </w:numPr>
+        <w:spacing w:before="100" w:beforeAutospacing="1" w:after="100" w:afterAutospacing="1" w:line="240" w:lineRule="auto"/>
+        <w:rPr>
+          <w:rFonts w:ascii="Times New Roman" w:eastAsia="Times New Roman" w:hAnsi="Times New Roman" w:cs="Times New Roman"/>
+          <w:sz w:val="24"/>
+          <w:szCs w:val="24"/>
+        </w:rPr>
+      </w:pPr>
+      <w:r>
+        <w:rPr>
+          <w:rFonts w:ascii="Times New Roman" w:eastAsia="Times New Roman" w:hAnsi="Times New Roman" w:cs="Times New Roman"/>
+          <w:sz w:val="24"/>
+          <w:szCs w:val="24"/>
+        </w:rPr>
+        <w:t xml:space="preserve">Differs from </w:t>
+      </w:r>
+      <w:r>
+        <w:rPr>
+          <w:rFonts w:ascii="Courier New" w:eastAsia="Times New Roman" w:hAnsi="Courier New" w:cs="Courier New"/>
+          <w:sz w:val="20"/>
+          <w:szCs w:val="20"/>
+        </w:rPr>
+        <w:t>--hard</w:t>
+      </w:r>
+      <w:r>
+        <w:rPr>
+          <w:rFonts w:ascii="Times New Roman" w:eastAsia="Times New Roman" w:hAnsi="Times New Roman" w:cs="Times New Roman"/>
+          <w:sz w:val="24"/>
+          <w:szCs w:val="24"/>
+        </w:rPr>
+        <w:t>, which would discard them entirely</w:t>
       </w:r>
     </w:p>
     <w:p>
@@ -5644,215 +6508,10 @@
     </w:p>
     <w:p>
       <w:pPr>
-        <w:pStyle w:val="Heading2"/>
-      </w:pPr>
-      <w:r>
-        <w:t xml:space="preserve">Task 23 — Demonstrate </w:t>
-      </w:r>
-      <w:proofErr w:type="spellStart"/>
-      <w:r>
-        <w:t>Git</w:t>
-      </w:r>
-      <w:proofErr w:type="spellEnd"/>
-      <w:r>
-        <w:t xml:space="preserve"> Restore</w:t>
-      </w:r>
-    </w:p>
-    <w:p>
-      <w:r>
-        <w:t xml:space="preserve">Modify style.css, inspect the changes, </w:t>
-      </w:r>
-      <w:proofErr w:type="gramStart"/>
-      <w:r>
-        <w:t>then</w:t>
-      </w:r>
-      <w:proofErr w:type="gramEnd"/>
-      <w:r>
-        <w:t xml:space="preserve"> discard the uncommitted modification.</w:t>
-      </w:r>
-    </w:p>
-    <w:p>
-      <w:pPr>
-        <w:spacing w:before="60" w:after="100"/>
-        <w:ind w:left="360"/>
-      </w:pPr>
-      <w:proofErr w:type="spellStart"/>
-      <w:proofErr w:type="gramStart"/>
-      <w:r>
-        <w:rPr>
-          <w:rFonts w:ascii="Consolas" w:hAnsi="Consolas"/>
-          <w:sz w:val="18"/>
-        </w:rPr>
-        <w:t>git</w:t>
-      </w:r>
-      <w:proofErr w:type="spellEnd"/>
-      <w:proofErr w:type="gramEnd"/>
-      <w:r>
-        <w:rPr>
-          <w:rFonts w:ascii="Consolas" w:hAnsi="Consolas"/>
-          <w:sz w:val="18"/>
-        </w:rPr>
-        <w:t xml:space="preserve"> diff</w:t>
-      </w:r>
-      <w:r>
-        <w:rPr>
-          <w:rFonts w:ascii="Consolas" w:hAnsi="Consolas"/>
-          <w:sz w:val="18"/>
-        </w:rPr>
-        <w:br/>
-      </w:r>
-      <w:proofErr w:type="spellStart"/>
-      <w:r>
-        <w:rPr>
-          <w:rFonts w:ascii="Consolas" w:hAnsi="Consolas"/>
-          <w:sz w:val="18"/>
-        </w:rPr>
-        <w:t>git</w:t>
-      </w:r>
-      <w:proofErr w:type="spellEnd"/>
-      <w:r>
-        <w:rPr>
-          <w:rFonts w:ascii="Consolas" w:hAnsi="Consolas"/>
-          <w:sz w:val="18"/>
-        </w:rPr>
-        <w:t xml:space="preserve"> restore style.css</w:t>
-      </w:r>
-      <w:r>
-        <w:rPr>
-          <w:rFonts w:ascii="Consolas" w:hAnsi="Consolas"/>
-          <w:sz w:val="18"/>
-        </w:rPr>
-        <w:br/>
-      </w:r>
-      <w:proofErr w:type="spellStart"/>
-      <w:r>
-        <w:rPr>
-          <w:rFonts w:ascii="Consolas" w:hAnsi="Consolas"/>
-          <w:sz w:val="18"/>
-        </w:rPr>
-        <w:t>git</w:t>
-      </w:r>
-      <w:proofErr w:type="spellEnd"/>
-      <w:r>
-        <w:rPr>
-          <w:rFonts w:ascii="Consolas" w:hAnsi="Consolas"/>
-          <w:sz w:val="18"/>
-        </w:rPr>
-        <w:t xml:space="preserve"> status</w:t>
-      </w:r>
-    </w:p>
-    <w:p>
-      <w:r>
-        <w:rPr>
-          <w:b/>
-        </w:rPr>
-        <w:t xml:space="preserve">📸 Screenshot 28 — </w:t>
-      </w:r>
-      <w:proofErr w:type="spellStart"/>
-      <w:r>
-        <w:rPr>
-          <w:b/>
-        </w:rPr>
-        <w:t>Git</w:t>
-      </w:r>
-      <w:proofErr w:type="spellEnd"/>
-      <w:r>
-        <w:rPr>
-          <w:b/>
-        </w:rPr>
-        <w:t xml:space="preserve"> Restore</w:t>
-      </w:r>
-    </w:p>
-    <w:p>
-      <w:r>
-        <w:t>Show the change before restore and clean status afterward.</w:t>
-      </w:r>
-    </w:p>
-    <w:tbl>
-      <w:tblPr>
-        <w:tblW w:w="0" w:type="auto"/>
-        <w:jc w:val="center"/>
-        <w:tblLook w:val="04A0" w:firstRow="1" w:lastRow="0" w:firstColumn="1" w:lastColumn="0" w:noHBand="0" w:noVBand="1"/>
-      </w:tblPr>
-      <w:tblGrid>
-        <w:gridCol w:w="10080"/>
-      </w:tblGrid>
-      <w:tr>
-        <w:trPr>
-          <w:jc w:val="center"/>
-        </w:trPr>
-        <w:tc>
-          <w:tcPr>
-            <w:tcW w:w="10080" w:type="dxa"/>
-            <w:shd w:val="clear" w:color="auto" w:fill="EDEDED"/>
-          </w:tcPr>
-          <w:p>
-            <w:pPr>
-              <w:jc w:val="center"/>
-            </w:pPr>
-            <w:r>
-              <w:rPr>
-                <w:sz w:val="18"/>
-              </w:rPr>
-              <w:t>[Insert Screenshot 28 here]</w:t>
-            </w:r>
-            <w:r>
-              <w:rPr>
-                <w:sz w:val="18"/>
-              </w:rPr>
-              <w:br/>
-            </w:r>
-            <w:r>
-              <w:rPr>
-                <w:sz w:val="18"/>
-              </w:rPr>
-              <w:br/>
-              <w:t>Evidence / output should be clearly visible.</w:t>
-            </w:r>
-          </w:p>
-        </w:tc>
-      </w:tr>
-    </w:tbl>
-    <w:p>
-      <w:pPr>
-        <w:jc w:val="center"/>
-      </w:pPr>
-      <w:r>
-        <w:rPr>
-          <w:i/>
-        </w:rPr>
-        <w:lastRenderedPageBreak/>
-        <w:t xml:space="preserve">Figure 28: </w:t>
-      </w:r>
-      <w:proofErr w:type="spellStart"/>
-      <w:r>
-        <w:rPr>
-          <w:i/>
-        </w:rPr>
-        <w:t>Git</w:t>
-      </w:r>
-      <w:proofErr w:type="spellEnd"/>
-      <w:r>
-        <w:rPr>
-          <w:i/>
-        </w:rPr>
-        <w:t xml:space="preserve"> Restore.</w:t>
-      </w:r>
-    </w:p>
-    <w:p>
-      <w:r>
-        <w:rPr>
-          <w:b/>
-        </w:rPr>
-        <w:t>Questions / Explanation:</w:t>
-      </w:r>
-    </w:p>
-    <w:p>
-      <w:pPr>
         <w:pStyle w:val="ListBullet"/>
       </w:pPr>
       <w:r>
-        <w:t>What happened to the uncommitted modification?</w:t>
+        <w:t>What happened to the file changes?</w:t>
       </w:r>
     </w:p>
     <w:p>
@@ -5870,7 +6529,7 @@
           <w:sz w:val="24"/>
           <w:szCs w:val="24"/>
         </w:rPr>
-        <w:t xml:space="preserve">When using </w:t>
+        <w:t xml:space="preserve">After </w:t>
       </w:r>
       <w:proofErr w:type="spellStart"/>
       <w:r>
@@ -5888,7 +6547,7 @@
           <w:sz w:val="20"/>
           <w:szCs w:val="20"/>
         </w:rPr>
-        <w:t xml:space="preserve"> restore &lt;file&gt;</w:t>
+        <w:t xml:space="preserve"> reset --soft HEAD~1</w:t>
       </w:r>
       <w:r>
         <w:rPr>
@@ -5903,7 +6562,7 @@
       <w:pPr>
         <w:numPr>
           <w:ilvl w:val="0"/>
-          <w:numId w:val="14"/>
+          <w:numId w:val="16"/>
         </w:numPr>
         <w:spacing w:before="100" w:beforeAutospacing="1" w:after="100" w:afterAutospacing="1" w:line="240" w:lineRule="auto"/>
         <w:rPr>
@@ -5912,14 +6571,6 @@
           <w:szCs w:val="24"/>
         </w:rPr>
       </w:pPr>
-      <w:r>
-        <w:rPr>
-          <w:rFonts w:ascii="Times New Roman" w:eastAsia="Times New Roman" w:hAnsi="Times New Roman" w:cs="Times New Roman"/>
-          <w:sz w:val="24"/>
-          <w:szCs w:val="24"/>
-        </w:rPr>
-        <w:t xml:space="preserve">The </w:t>
-      </w:r>
       <w:r>
         <w:rPr>
           <w:rFonts w:ascii="Times New Roman" w:eastAsia="Times New Roman" w:hAnsi="Times New Roman" w:cs="Times New Roman"/>
@@ -5928,76 +6579,66 @@
           <w:sz w:val="24"/>
           <w:szCs w:val="24"/>
         </w:rPr>
-        <w:t>uncommitted changes are permanently discarded</w:t>
-      </w:r>
-    </w:p>
-    <w:p>
-      <w:pPr>
-        <w:numPr>
-          <w:ilvl w:val="0"/>
-          <w:numId w:val="14"/>
-        </w:numPr>
-        <w:spacing w:before="100" w:beforeAutospacing="1" w:after="100" w:afterAutospacing="1" w:line="240" w:lineRule="auto"/>
+        <w:t>File changes remain intact</w:t>
+      </w:r>
+      <w:r>
         <w:rPr>
           <w:rFonts w:ascii="Times New Roman" w:eastAsia="Times New Roman" w:hAnsi="Times New Roman" w:cs="Times New Roman"/>
           <w:sz w:val="24"/>
           <w:szCs w:val="24"/>
         </w:rPr>
-      </w:pPr>
-      <w:r>
+        <w:t xml:space="preserve"> in the staging area</w:t>
+      </w:r>
+    </w:p>
+    <w:p>
+      <w:pPr>
+        <w:numPr>
+          <w:ilvl w:val="0"/>
+          <w:numId w:val="16"/>
+        </w:numPr>
+        <w:spacing w:before="100" w:beforeAutospacing="1" w:after="100" w:afterAutospacing="1" w:line="240" w:lineRule="auto"/>
         <w:rPr>
           <w:rFonts w:ascii="Times New Roman" w:eastAsia="Times New Roman" w:hAnsi="Times New Roman" w:cs="Times New Roman"/>
           <w:sz w:val="24"/>
           <w:szCs w:val="24"/>
         </w:rPr>
-        <w:t>Working directory reverts to the last committed state</w:t>
-      </w:r>
-    </w:p>
-    <w:p>
-      <w:pPr>
-        <w:numPr>
-          <w:ilvl w:val="0"/>
-          <w:numId w:val="14"/>
-        </w:numPr>
-        <w:spacing w:before="100" w:beforeAutospacing="1" w:after="100" w:afterAutospacing="1" w:line="240" w:lineRule="auto"/>
+      </w:pPr>
+      <w:r>
         <w:rPr>
           <w:rFonts w:ascii="Times New Roman" w:eastAsia="Times New Roman" w:hAnsi="Times New Roman" w:cs="Times New Roman"/>
           <w:sz w:val="24"/>
           <w:szCs w:val="24"/>
         </w:rPr>
-      </w:pPr>
-      <w:r>
+        <w:t>Files are marked as "Changes to be committed"</w:t>
+      </w:r>
+    </w:p>
+    <w:p>
+      <w:pPr>
+        <w:numPr>
+          <w:ilvl w:val="0"/>
+          <w:numId w:val="16"/>
+        </w:numPr>
+        <w:spacing w:before="100" w:beforeAutospacing="1" w:after="100" w:afterAutospacing="1" w:line="240" w:lineRule="auto"/>
         <w:rPr>
           <w:rFonts w:ascii="Times New Roman" w:eastAsia="Times New Roman" w:hAnsi="Times New Roman" w:cs="Times New Roman"/>
           <w:sz w:val="24"/>
           <w:szCs w:val="24"/>
         </w:rPr>
-        <w:t xml:space="preserve">Changes are </w:t>
-      </w:r>
-      <w:r>
-        <w:rPr>
-          <w:rFonts w:ascii="Times New Roman" w:eastAsia="Times New Roman" w:hAnsi="Times New Roman" w:cs="Times New Roman"/>
-          <w:b/>
-          <w:bCs/>
-          <w:sz w:val="24"/>
-          <w:szCs w:val="24"/>
-        </w:rPr>
-        <w:t>not recoverable</w:t>
-      </w:r>
+      </w:pPr>
       <w:r>
         <w:rPr>
           <w:rFonts w:ascii="Times New Roman" w:eastAsia="Times New Roman" w:hAnsi="Times New Roman" w:cs="Times New Roman"/>
           <w:sz w:val="24"/>
           <w:szCs w:val="24"/>
         </w:rPr>
-        <w:t xml:space="preserve"> (unless previously stashed)</w:t>
+        <w:t>Developer can re-examine, modify, or split changes before a new commit</w:t>
       </w:r>
     </w:p>
     <w:p>
       <w:pPr>
         <w:numPr>
           <w:ilvl w:val="0"/>
-          <w:numId w:val="14"/>
+          <w:numId w:val="16"/>
         </w:numPr>
         <w:spacing w:before="100" w:beforeAutospacing="1" w:after="100" w:afterAutospacing="1" w:line="240" w:lineRule="auto"/>
         <w:rPr>
@@ -6012,7 +6653,41 @@
           <w:sz w:val="24"/>
           <w:szCs w:val="24"/>
         </w:rPr>
-        <w:t>This is irreversible, so it should only be used when intentionally abandoning changes</w:t>
+        <w:t xml:space="preserve">Running </w:t>
+      </w:r>
+      <w:proofErr w:type="spellStart"/>
+      <w:r>
+        <w:rPr>
+          <w:rFonts w:ascii="Courier New" w:eastAsia="Times New Roman" w:hAnsi="Courier New" w:cs="Courier New"/>
+          <w:sz w:val="20"/>
+          <w:szCs w:val="20"/>
+        </w:rPr>
+        <w:t>git</w:t>
+      </w:r>
+      <w:proofErr w:type="spellEnd"/>
+      <w:r>
+        <w:rPr>
+          <w:rFonts w:ascii="Courier New" w:eastAsia="Times New Roman" w:hAnsi="Courier New" w:cs="Courier New"/>
+          <w:sz w:val="20"/>
+          <w:szCs w:val="20"/>
+        </w:rPr>
+        <w:t xml:space="preserve"> commit</w:t>
+      </w:r>
+      <w:r>
+        <w:rPr>
+          <w:rFonts w:ascii="Times New Roman" w:eastAsia="Times New Roman" w:hAnsi="Times New Roman" w:cs="Times New Roman"/>
+          <w:sz w:val="24"/>
+          <w:szCs w:val="24"/>
+        </w:rPr>
+        <w:t xml:space="preserve"> again will create a fresh commit with the same content</w:t>
+      </w:r>
+      <w:r>
+        <w:rPr>
+          <w:rFonts w:ascii="Times New Roman" w:eastAsia="Times New Roman" w:hAnsi="Times New Roman" w:cs="Times New Roman"/>
+          <w:sz w:val="24"/>
+          <w:szCs w:val="24"/>
+        </w:rPr>
+        <w:t>.</w:t>
       </w:r>
     </w:p>
     <w:p>
@@ -6027,263 +6702,10 @@
     </w:p>
     <w:p>
       <w:pPr>
-        <w:pStyle w:val="Heading2"/>
-      </w:pPr>
-      <w:r>
-        <w:t xml:space="preserve">Task 24 — Demonstrate </w:t>
-      </w:r>
-      <w:proofErr w:type="spellStart"/>
-      <w:r>
-        <w:t>Git</w:t>
-      </w:r>
-      <w:proofErr w:type="spellEnd"/>
-      <w:r>
-        <w:t xml:space="preserve"> Reset</w:t>
-      </w:r>
-    </w:p>
-    <w:p>
-      <w:r>
-        <w:t>Create a temporary commit and then use a soft reset to remove the commit while keeping the changes staged.</w:t>
-      </w:r>
-    </w:p>
-    <w:p>
-      <w:pPr>
-        <w:spacing w:before="60" w:after="100"/>
-        <w:ind w:left="360"/>
-      </w:pPr>
-      <w:proofErr w:type="spellStart"/>
-      <w:proofErr w:type="gramStart"/>
-      <w:r>
-        <w:rPr>
-          <w:rFonts w:ascii="Consolas" w:hAnsi="Consolas"/>
-          <w:sz w:val="18"/>
-        </w:rPr>
-        <w:t>git</w:t>
-      </w:r>
-      <w:proofErr w:type="spellEnd"/>
-      <w:proofErr w:type="gramEnd"/>
-      <w:r>
-        <w:rPr>
-          <w:rFonts w:ascii="Consolas" w:hAnsi="Consolas"/>
-          <w:sz w:val="18"/>
-        </w:rPr>
-        <w:t xml:space="preserve"> add .</w:t>
-      </w:r>
-      <w:r>
-        <w:rPr>
-          <w:rFonts w:ascii="Consolas" w:hAnsi="Consolas"/>
-          <w:sz w:val="18"/>
-        </w:rPr>
-        <w:br/>
-      </w:r>
-      <w:proofErr w:type="spellStart"/>
-      <w:proofErr w:type="gramStart"/>
-      <w:r>
-        <w:rPr>
-          <w:rFonts w:ascii="Consolas" w:hAnsi="Consolas"/>
-          <w:sz w:val="18"/>
-        </w:rPr>
-        <w:t>git</w:t>
-      </w:r>
-      <w:proofErr w:type="spellEnd"/>
-      <w:proofErr w:type="gramEnd"/>
-      <w:r>
-        <w:rPr>
-          <w:rFonts w:ascii="Consolas" w:hAnsi="Consolas"/>
-          <w:sz w:val="18"/>
-        </w:rPr>
-        <w:t xml:space="preserve"> commit -m "Temporary test commit"</w:t>
-      </w:r>
-      <w:r>
-        <w:rPr>
-          <w:rFonts w:ascii="Consolas" w:hAnsi="Consolas"/>
-          <w:sz w:val="18"/>
-        </w:rPr>
-        <w:br/>
-      </w:r>
-      <w:proofErr w:type="spellStart"/>
-      <w:r>
-        <w:rPr>
-          <w:rFonts w:ascii="Consolas" w:hAnsi="Consolas"/>
-          <w:sz w:val="18"/>
-        </w:rPr>
-        <w:t>git</w:t>
-      </w:r>
-      <w:proofErr w:type="spellEnd"/>
-      <w:r>
-        <w:rPr>
-          <w:rFonts w:ascii="Consolas" w:hAnsi="Consolas"/>
-          <w:sz w:val="18"/>
-        </w:rPr>
-        <w:t xml:space="preserve"> log --</w:t>
-      </w:r>
-      <w:proofErr w:type="spellStart"/>
-      <w:r>
-        <w:rPr>
-          <w:rFonts w:ascii="Consolas" w:hAnsi="Consolas"/>
-          <w:sz w:val="18"/>
-        </w:rPr>
-        <w:t>oneline</w:t>
-      </w:r>
-      <w:proofErr w:type="spellEnd"/>
-      <w:r>
-        <w:rPr>
-          <w:rFonts w:ascii="Consolas" w:hAnsi="Consolas"/>
-          <w:sz w:val="18"/>
-        </w:rPr>
-        <w:br/>
-      </w:r>
-      <w:proofErr w:type="spellStart"/>
-      <w:r>
-        <w:rPr>
-          <w:rFonts w:ascii="Consolas" w:hAnsi="Consolas"/>
-          <w:sz w:val="18"/>
-        </w:rPr>
-        <w:t>git</w:t>
-      </w:r>
-      <w:proofErr w:type="spellEnd"/>
-      <w:r>
-        <w:rPr>
-          <w:rFonts w:ascii="Consolas" w:hAnsi="Consolas"/>
-          <w:sz w:val="18"/>
-        </w:rPr>
-        <w:t xml:space="preserve"> reset --soft HEAD~1</w:t>
-      </w:r>
-      <w:r>
-        <w:rPr>
-          <w:rFonts w:ascii="Consolas" w:hAnsi="Consolas"/>
-          <w:sz w:val="18"/>
-        </w:rPr>
-        <w:br/>
-      </w:r>
-      <w:proofErr w:type="spellStart"/>
-      <w:r>
-        <w:rPr>
-          <w:rFonts w:ascii="Consolas" w:hAnsi="Consolas"/>
-          <w:sz w:val="18"/>
-        </w:rPr>
-        <w:t>git</w:t>
-      </w:r>
-      <w:proofErr w:type="spellEnd"/>
-      <w:r>
-        <w:rPr>
-          <w:rFonts w:ascii="Consolas" w:hAnsi="Consolas"/>
-          <w:sz w:val="18"/>
-        </w:rPr>
-        <w:t xml:space="preserve"> status</w:t>
-      </w:r>
-    </w:p>
-    <w:p>
-      <w:r>
-        <w:rPr>
-          <w:b/>
-        </w:rPr>
-        <w:t xml:space="preserve">📸 Screenshot 29 — </w:t>
-      </w:r>
-      <w:proofErr w:type="spellStart"/>
-      <w:r>
-        <w:rPr>
-          <w:b/>
-        </w:rPr>
-        <w:t>Git</w:t>
-      </w:r>
-      <w:proofErr w:type="spellEnd"/>
-      <w:r>
-        <w:rPr>
-          <w:b/>
-        </w:rPr>
-        <w:t xml:space="preserve"> Reset</w:t>
-      </w:r>
-    </w:p>
-    <w:p>
-      <w:r>
-        <w:t>Show the temporary commit and the result of the soft reset.</w:t>
-      </w:r>
-    </w:p>
-    <w:tbl>
-      <w:tblPr>
-        <w:tblW w:w="0" w:type="auto"/>
-        <w:jc w:val="center"/>
-        <w:tblLook w:val="04A0" w:firstRow="1" w:lastRow="0" w:firstColumn="1" w:lastColumn="0" w:noHBand="0" w:noVBand="1"/>
-      </w:tblPr>
-      <w:tblGrid>
-        <w:gridCol w:w="10080"/>
-      </w:tblGrid>
-      <w:tr>
-        <w:trPr>
-          <w:jc w:val="center"/>
-        </w:trPr>
-        <w:tc>
-          <w:tcPr>
-            <w:tcW w:w="10080" w:type="dxa"/>
-            <w:shd w:val="clear" w:color="auto" w:fill="EDEDED"/>
-          </w:tcPr>
-          <w:p>
-            <w:pPr>
-              <w:jc w:val="center"/>
-            </w:pPr>
-            <w:r>
-              <w:rPr>
-                <w:sz w:val="18"/>
-              </w:rPr>
-              <w:t>[Insert Screenshot 29 here]</w:t>
-            </w:r>
-            <w:r>
-              <w:rPr>
-                <w:sz w:val="18"/>
-              </w:rPr>
-              <w:br/>
-            </w:r>
-            <w:r>
-              <w:rPr>
-                <w:sz w:val="18"/>
-              </w:rPr>
-              <w:br/>
-              <w:t>Evidence / output should be clearly visible.</w:t>
-            </w:r>
-          </w:p>
-        </w:tc>
-      </w:tr>
-    </w:tbl>
-    <w:p>
-      <w:pPr>
-        <w:jc w:val="center"/>
-      </w:pPr>
-      <w:r>
-        <w:rPr>
-          <w:i/>
-        </w:rPr>
-        <w:t xml:space="preserve">Figure 29: </w:t>
-      </w:r>
-      <w:proofErr w:type="spellStart"/>
-      <w:r>
-        <w:rPr>
-          <w:i/>
-        </w:rPr>
-        <w:t>Git</w:t>
-      </w:r>
-      <w:proofErr w:type="spellEnd"/>
-      <w:r>
-        <w:rPr>
-          <w:i/>
-        </w:rPr>
-        <w:t xml:space="preserve"> Reset.</w:t>
-      </w:r>
-    </w:p>
-    <w:p>
-      <w:r>
-        <w:rPr>
-          <w:b/>
-        </w:rPr>
-        <w:t>Questions / Explanation:</w:t>
-      </w:r>
-    </w:p>
-    <w:p>
-      <w:pPr>
         <w:pStyle w:val="ListBullet"/>
       </w:pPr>
       <w:r>
-        <w:t>What happened to the commit?</w:t>
+        <w:t>What does --soft mean?</w:t>
       </w:r>
     </w:p>
     <w:p>
@@ -6297,59 +6719,19 @@
       </w:pPr>
       <w:r>
         <w:rPr>
+          <w:rFonts w:ascii="Courier New" w:eastAsia="Times New Roman" w:hAnsi="Courier New" w:cs="Courier New"/>
+          <w:sz w:val="20"/>
+          <w:szCs w:val="20"/>
+        </w:rPr>
+        <w:t>--soft</w:t>
+      </w:r>
+      <w:r>
+        <w:rPr>
           <w:rFonts w:ascii="Times New Roman" w:eastAsia="Times New Roman" w:hAnsi="Times New Roman" w:cs="Times New Roman"/>
           <w:sz w:val="24"/>
           <w:szCs w:val="24"/>
         </w:rPr>
-        <w:t xml:space="preserve">With </w:t>
-      </w:r>
-      <w:proofErr w:type="spellStart"/>
-      <w:r>
-        <w:rPr>
-          <w:rFonts w:ascii="Courier New" w:eastAsia="Times New Roman" w:hAnsi="Courier New" w:cs="Courier New"/>
-          <w:sz w:val="20"/>
-          <w:szCs w:val="20"/>
-        </w:rPr>
-        <w:t>git</w:t>
-      </w:r>
-      <w:proofErr w:type="spellEnd"/>
-      <w:r>
-        <w:rPr>
-          <w:rFonts w:ascii="Courier New" w:eastAsia="Times New Roman" w:hAnsi="Courier New" w:cs="Courier New"/>
-          <w:sz w:val="20"/>
-          <w:szCs w:val="20"/>
-        </w:rPr>
-        <w:t xml:space="preserve"> reset --soft HEAD~1</w:t>
-      </w:r>
-      <w:r>
-        <w:rPr>
-          <w:rFonts w:ascii="Times New Roman" w:eastAsia="Times New Roman" w:hAnsi="Times New Roman" w:cs="Times New Roman"/>
-          <w:sz w:val="24"/>
-          <w:szCs w:val="24"/>
-        </w:rPr>
-        <w:t>:</w:t>
-      </w:r>
-    </w:p>
-    <w:p>
-      <w:pPr>
-        <w:numPr>
-          <w:ilvl w:val="0"/>
-          <w:numId w:val="15"/>
-        </w:numPr>
-        <w:spacing w:before="100" w:beforeAutospacing="1" w:after="100" w:afterAutospacing="1" w:line="240" w:lineRule="auto"/>
-        <w:rPr>
-          <w:rFonts w:ascii="Times New Roman" w:eastAsia="Times New Roman" w:hAnsi="Times New Roman" w:cs="Times New Roman"/>
-          <w:sz w:val="24"/>
-          <w:szCs w:val="24"/>
-        </w:rPr>
-      </w:pPr>
-      <w:r>
-        <w:rPr>
-          <w:rFonts w:ascii="Times New Roman" w:eastAsia="Times New Roman" w:hAnsi="Times New Roman" w:cs="Times New Roman"/>
-          <w:sz w:val="24"/>
-          <w:szCs w:val="24"/>
-        </w:rPr>
-        <w:t xml:space="preserve">The </w:t>
+        <w:t xml:space="preserve"> is a reset mode that </w:t>
       </w:r>
       <w:r>
         <w:rPr>
@@ -6359,396 +6741,6 @@
           <w:sz w:val="24"/>
           <w:szCs w:val="24"/>
         </w:rPr>
-        <w:t>commit is removed</w:t>
-      </w:r>
-      <w:r>
-        <w:rPr>
-          <w:rFonts w:ascii="Times New Roman" w:eastAsia="Times New Roman" w:hAnsi="Times New Roman" w:cs="Times New Roman"/>
-          <w:sz w:val="24"/>
-          <w:szCs w:val="24"/>
-        </w:rPr>
-        <w:t xml:space="preserve"> and HEAD pointer moves back one commit</w:t>
-      </w:r>
-    </w:p>
-    <w:p>
-      <w:pPr>
-        <w:numPr>
-          <w:ilvl w:val="0"/>
-          <w:numId w:val="15"/>
-        </w:numPr>
-        <w:spacing w:before="100" w:beforeAutospacing="1" w:after="100" w:afterAutospacing="1" w:line="240" w:lineRule="auto"/>
-        <w:rPr>
-          <w:rFonts w:ascii="Times New Roman" w:eastAsia="Times New Roman" w:hAnsi="Times New Roman" w:cs="Times New Roman"/>
-          <w:sz w:val="24"/>
-          <w:szCs w:val="24"/>
-        </w:rPr>
-      </w:pPr>
-      <w:r>
-        <w:rPr>
-          <w:rFonts w:ascii="Times New Roman" w:eastAsia="Times New Roman" w:hAnsi="Times New Roman" w:cs="Times New Roman"/>
-          <w:sz w:val="24"/>
-          <w:szCs w:val="24"/>
-        </w:rPr>
-        <w:t xml:space="preserve">The </w:t>
-      </w:r>
-      <w:r>
-        <w:rPr>
-          <w:rFonts w:ascii="Courier New" w:eastAsia="Times New Roman" w:hAnsi="Courier New" w:cs="Courier New"/>
-          <w:sz w:val="20"/>
-          <w:szCs w:val="20"/>
-        </w:rPr>
-        <w:t>--soft</w:t>
-      </w:r>
-      <w:r>
-        <w:rPr>
-          <w:rFonts w:ascii="Times New Roman" w:eastAsia="Times New Roman" w:hAnsi="Times New Roman" w:cs="Times New Roman"/>
-          <w:sz w:val="24"/>
-          <w:szCs w:val="24"/>
-        </w:rPr>
-        <w:t xml:space="preserve"> flag is critical: </w:t>
-      </w:r>
-      <w:r>
-        <w:rPr>
-          <w:rFonts w:ascii="Times New Roman" w:eastAsia="Times New Roman" w:hAnsi="Times New Roman" w:cs="Times New Roman"/>
-          <w:b/>
-          <w:bCs/>
-          <w:sz w:val="24"/>
-          <w:szCs w:val="24"/>
-        </w:rPr>
-        <w:t>changes remain staged</w:t>
-      </w:r>
-      <w:r>
-        <w:rPr>
-          <w:rFonts w:ascii="Times New Roman" w:eastAsia="Times New Roman" w:hAnsi="Times New Roman" w:cs="Times New Roman"/>
-          <w:sz w:val="24"/>
-          <w:szCs w:val="24"/>
-        </w:rPr>
-        <w:t xml:space="preserve"> in the index</w:t>
-      </w:r>
-    </w:p>
-    <w:p>
-      <w:pPr>
-        <w:numPr>
-          <w:ilvl w:val="0"/>
-          <w:numId w:val="15"/>
-        </w:numPr>
-        <w:spacing w:before="100" w:beforeAutospacing="1" w:after="100" w:afterAutospacing="1" w:line="240" w:lineRule="auto"/>
-        <w:rPr>
-          <w:rFonts w:ascii="Times New Roman" w:eastAsia="Times New Roman" w:hAnsi="Times New Roman" w:cs="Times New Roman"/>
-          <w:sz w:val="24"/>
-          <w:szCs w:val="24"/>
-        </w:rPr>
-      </w:pPr>
-      <w:r>
-        <w:rPr>
-          <w:rFonts w:ascii="Times New Roman" w:eastAsia="Times New Roman" w:hAnsi="Times New Roman" w:cs="Times New Roman"/>
-          <w:sz w:val="24"/>
-          <w:szCs w:val="24"/>
-        </w:rPr>
-        <w:t xml:space="preserve">Changes are </w:t>
-      </w:r>
-      <w:r>
-        <w:rPr>
-          <w:rFonts w:ascii="Times New Roman" w:eastAsia="Times New Roman" w:hAnsi="Times New Roman" w:cs="Times New Roman"/>
-          <w:b/>
-          <w:bCs/>
-          <w:sz w:val="24"/>
-          <w:szCs w:val="24"/>
-        </w:rPr>
-        <w:t>not lost</w:t>
-      </w:r>
-      <w:r>
-        <w:rPr>
-          <w:rFonts w:ascii="Times New Roman" w:eastAsia="Times New Roman" w:hAnsi="Times New Roman" w:cs="Times New Roman"/>
-          <w:sz w:val="24"/>
-          <w:szCs w:val="24"/>
-        </w:rPr>
-        <w:t>—they stay in the staging area ready for re-commit</w:t>
-      </w:r>
-    </w:p>
-    <w:p>
-      <w:pPr>
-        <w:numPr>
-          <w:ilvl w:val="0"/>
-          <w:numId w:val="15"/>
-        </w:numPr>
-        <w:spacing w:before="100" w:beforeAutospacing="1" w:after="100" w:afterAutospacing="1" w:line="240" w:lineRule="auto"/>
-        <w:rPr>
-          <w:rFonts w:ascii="Times New Roman" w:eastAsia="Times New Roman" w:hAnsi="Times New Roman" w:cs="Times New Roman"/>
-          <w:sz w:val="24"/>
-          <w:szCs w:val="24"/>
-        </w:rPr>
-      </w:pPr>
-      <w:r>
-        <w:rPr>
-          <w:rFonts w:ascii="Times New Roman" w:eastAsia="Times New Roman" w:hAnsi="Times New Roman" w:cs="Times New Roman"/>
-          <w:sz w:val="24"/>
-          <w:szCs w:val="24"/>
-        </w:rPr>
-        <w:t xml:space="preserve">Differs from </w:t>
-      </w:r>
-      <w:r>
-        <w:rPr>
-          <w:rFonts w:ascii="Courier New" w:eastAsia="Times New Roman" w:hAnsi="Courier New" w:cs="Courier New"/>
-          <w:sz w:val="20"/>
-          <w:szCs w:val="20"/>
-        </w:rPr>
-        <w:t>--hard</w:t>
-      </w:r>
-      <w:r>
-        <w:rPr>
-          <w:rFonts w:ascii="Times New Roman" w:eastAsia="Times New Roman" w:hAnsi="Times New Roman" w:cs="Times New Roman"/>
-          <w:sz w:val="24"/>
-          <w:szCs w:val="24"/>
-        </w:rPr>
-        <w:t>, which would discard them entirely</w:t>
-      </w:r>
-    </w:p>
-    <w:p>
-      <w:pPr>
-        <w:pStyle w:val="ListBullet"/>
-        <w:numPr>
-          <w:ilvl w:val="0"/>
-          <w:numId w:val="0"/>
-        </w:numPr>
-        <w:ind w:left="360"/>
-      </w:pPr>
-    </w:p>
-    <w:p>
-      <w:pPr>
-        <w:pStyle w:val="ListBullet"/>
-      </w:pPr>
-      <w:r>
-        <w:t>What happened to the file changes?</w:t>
-      </w:r>
-    </w:p>
-    <w:p>
-      <w:pPr>
-        <w:spacing w:before="100" w:beforeAutospacing="1" w:after="100" w:afterAutospacing="1" w:line="240" w:lineRule="auto"/>
-        <w:rPr>
-          <w:rFonts w:ascii="Times New Roman" w:eastAsia="Times New Roman" w:hAnsi="Times New Roman" w:cs="Times New Roman"/>
-          <w:sz w:val="24"/>
-          <w:szCs w:val="24"/>
-        </w:rPr>
-      </w:pPr>
-      <w:r>
-        <w:rPr>
-          <w:rFonts w:ascii="Times New Roman" w:eastAsia="Times New Roman" w:hAnsi="Times New Roman" w:cs="Times New Roman"/>
-          <w:sz w:val="24"/>
-          <w:szCs w:val="24"/>
-        </w:rPr>
-        <w:t xml:space="preserve">After </w:t>
-      </w:r>
-      <w:proofErr w:type="spellStart"/>
-      <w:r>
-        <w:rPr>
-          <w:rFonts w:ascii="Courier New" w:eastAsia="Times New Roman" w:hAnsi="Courier New" w:cs="Courier New"/>
-          <w:sz w:val="20"/>
-          <w:szCs w:val="20"/>
-        </w:rPr>
-        <w:t>git</w:t>
-      </w:r>
-      <w:proofErr w:type="spellEnd"/>
-      <w:r>
-        <w:rPr>
-          <w:rFonts w:ascii="Courier New" w:eastAsia="Times New Roman" w:hAnsi="Courier New" w:cs="Courier New"/>
-          <w:sz w:val="20"/>
-          <w:szCs w:val="20"/>
-        </w:rPr>
-        <w:t xml:space="preserve"> reset --soft HEAD~1</w:t>
-      </w:r>
-      <w:r>
-        <w:rPr>
-          <w:rFonts w:ascii="Times New Roman" w:eastAsia="Times New Roman" w:hAnsi="Times New Roman" w:cs="Times New Roman"/>
-          <w:sz w:val="24"/>
-          <w:szCs w:val="24"/>
-        </w:rPr>
-        <w:t>:</w:t>
-      </w:r>
-    </w:p>
-    <w:p>
-      <w:pPr>
-        <w:numPr>
-          <w:ilvl w:val="0"/>
-          <w:numId w:val="16"/>
-        </w:numPr>
-        <w:spacing w:before="100" w:beforeAutospacing="1" w:after="100" w:afterAutospacing="1" w:line="240" w:lineRule="auto"/>
-        <w:rPr>
-          <w:rFonts w:ascii="Times New Roman" w:eastAsia="Times New Roman" w:hAnsi="Times New Roman" w:cs="Times New Roman"/>
-          <w:sz w:val="24"/>
-          <w:szCs w:val="24"/>
-        </w:rPr>
-      </w:pPr>
-      <w:r>
-        <w:rPr>
-          <w:rFonts w:ascii="Times New Roman" w:eastAsia="Times New Roman" w:hAnsi="Times New Roman" w:cs="Times New Roman"/>
-          <w:b/>
-          <w:bCs/>
-          <w:sz w:val="24"/>
-          <w:szCs w:val="24"/>
-        </w:rPr>
-        <w:t>File changes remain intact</w:t>
-      </w:r>
-      <w:r>
-        <w:rPr>
-          <w:rFonts w:ascii="Times New Roman" w:eastAsia="Times New Roman" w:hAnsi="Times New Roman" w:cs="Times New Roman"/>
-          <w:sz w:val="24"/>
-          <w:szCs w:val="24"/>
-        </w:rPr>
-        <w:t xml:space="preserve"> in the staging area</w:t>
-      </w:r>
-    </w:p>
-    <w:p>
-      <w:pPr>
-        <w:numPr>
-          <w:ilvl w:val="0"/>
-          <w:numId w:val="16"/>
-        </w:numPr>
-        <w:spacing w:before="100" w:beforeAutospacing="1" w:after="100" w:afterAutospacing="1" w:line="240" w:lineRule="auto"/>
-        <w:rPr>
-          <w:rFonts w:ascii="Times New Roman" w:eastAsia="Times New Roman" w:hAnsi="Times New Roman" w:cs="Times New Roman"/>
-          <w:sz w:val="24"/>
-          <w:szCs w:val="24"/>
-        </w:rPr>
-      </w:pPr>
-      <w:r>
-        <w:rPr>
-          <w:rFonts w:ascii="Times New Roman" w:eastAsia="Times New Roman" w:hAnsi="Times New Roman" w:cs="Times New Roman"/>
-          <w:sz w:val="24"/>
-          <w:szCs w:val="24"/>
-        </w:rPr>
-        <w:t>Files are marked as "Changes to be committed"</w:t>
-      </w:r>
-    </w:p>
-    <w:p>
-      <w:pPr>
-        <w:numPr>
-          <w:ilvl w:val="0"/>
-          <w:numId w:val="16"/>
-        </w:numPr>
-        <w:spacing w:before="100" w:beforeAutospacing="1" w:after="100" w:afterAutospacing="1" w:line="240" w:lineRule="auto"/>
-        <w:rPr>
-          <w:rFonts w:ascii="Times New Roman" w:eastAsia="Times New Roman" w:hAnsi="Times New Roman" w:cs="Times New Roman"/>
-          <w:sz w:val="24"/>
-          <w:szCs w:val="24"/>
-        </w:rPr>
-      </w:pPr>
-      <w:r>
-        <w:rPr>
-          <w:rFonts w:ascii="Times New Roman" w:eastAsia="Times New Roman" w:hAnsi="Times New Roman" w:cs="Times New Roman"/>
-          <w:sz w:val="24"/>
-          <w:szCs w:val="24"/>
-        </w:rPr>
-        <w:t>Developer can re-examine, modify, or split changes before a new commit</w:t>
-      </w:r>
-    </w:p>
-    <w:p>
-      <w:pPr>
-        <w:numPr>
-          <w:ilvl w:val="0"/>
-          <w:numId w:val="16"/>
-        </w:numPr>
-        <w:spacing w:before="100" w:beforeAutospacing="1" w:after="100" w:afterAutospacing="1" w:line="240" w:lineRule="auto"/>
-        <w:rPr>
-          <w:rFonts w:ascii="Times New Roman" w:eastAsia="Times New Roman" w:hAnsi="Times New Roman" w:cs="Times New Roman"/>
-          <w:sz w:val="24"/>
-          <w:szCs w:val="24"/>
-        </w:rPr>
-      </w:pPr>
-      <w:r>
-        <w:rPr>
-          <w:rFonts w:ascii="Times New Roman" w:eastAsia="Times New Roman" w:hAnsi="Times New Roman" w:cs="Times New Roman"/>
-          <w:sz w:val="24"/>
-          <w:szCs w:val="24"/>
-        </w:rPr>
-        <w:t xml:space="preserve">Running </w:t>
-      </w:r>
-      <w:proofErr w:type="spellStart"/>
-      <w:r>
-        <w:rPr>
-          <w:rFonts w:ascii="Courier New" w:eastAsia="Times New Roman" w:hAnsi="Courier New" w:cs="Courier New"/>
-          <w:sz w:val="20"/>
-          <w:szCs w:val="20"/>
-        </w:rPr>
-        <w:t>git</w:t>
-      </w:r>
-      <w:proofErr w:type="spellEnd"/>
-      <w:r>
-        <w:rPr>
-          <w:rFonts w:ascii="Courier New" w:eastAsia="Times New Roman" w:hAnsi="Courier New" w:cs="Courier New"/>
-          <w:sz w:val="20"/>
-          <w:szCs w:val="20"/>
-        </w:rPr>
-        <w:t xml:space="preserve"> commit</w:t>
-      </w:r>
-      <w:r>
-        <w:rPr>
-          <w:rFonts w:ascii="Times New Roman" w:eastAsia="Times New Roman" w:hAnsi="Times New Roman" w:cs="Times New Roman"/>
-          <w:sz w:val="24"/>
-          <w:szCs w:val="24"/>
-        </w:rPr>
-        <w:t xml:space="preserve"> again will create a fresh commit with the same content</w:t>
-      </w:r>
-      <w:r>
-        <w:rPr>
-          <w:rFonts w:ascii="Times New Roman" w:eastAsia="Times New Roman" w:hAnsi="Times New Roman" w:cs="Times New Roman"/>
-          <w:sz w:val="24"/>
-          <w:szCs w:val="24"/>
-        </w:rPr>
-        <w:t>.</w:t>
-      </w:r>
-    </w:p>
-    <w:p>
-      <w:pPr>
-        <w:pStyle w:val="ListBullet"/>
-        <w:numPr>
-          <w:ilvl w:val="0"/>
-          <w:numId w:val="0"/>
-        </w:numPr>
-        <w:ind w:left="360"/>
-      </w:pPr>
-    </w:p>
-    <w:p>
-      <w:pPr>
-        <w:pStyle w:val="ListBullet"/>
-      </w:pPr>
-      <w:r>
-        <w:t>What does --soft mean?</w:t>
-      </w:r>
-    </w:p>
-    <w:p>
-      <w:pPr>
-        <w:spacing w:before="100" w:beforeAutospacing="1" w:after="100" w:afterAutospacing="1" w:line="240" w:lineRule="auto"/>
-        <w:rPr>
-          <w:rFonts w:ascii="Times New Roman" w:eastAsia="Times New Roman" w:hAnsi="Times New Roman" w:cs="Times New Roman"/>
-          <w:sz w:val="24"/>
-          <w:szCs w:val="24"/>
-        </w:rPr>
-      </w:pPr>
-      <w:r>
-        <w:rPr>
-          <w:rFonts w:ascii="Courier New" w:eastAsia="Times New Roman" w:hAnsi="Courier New" w:cs="Courier New"/>
-          <w:sz w:val="20"/>
-          <w:szCs w:val="20"/>
-        </w:rPr>
-        <w:t>--soft</w:t>
-      </w:r>
-      <w:r>
-        <w:rPr>
-          <w:rFonts w:ascii="Times New Roman" w:eastAsia="Times New Roman" w:hAnsi="Times New Roman" w:cs="Times New Roman"/>
-          <w:sz w:val="24"/>
-          <w:szCs w:val="24"/>
-        </w:rPr>
-        <w:t xml:space="preserve"> is a reset mode that </w:t>
-      </w:r>
-      <w:r>
-        <w:rPr>
-          <w:rFonts w:ascii="Times New Roman" w:eastAsia="Times New Roman" w:hAnsi="Times New Roman" w:cs="Times New Roman"/>
-          <w:b/>
-          <w:bCs/>
-          <w:sz w:val="24"/>
-          <w:szCs w:val="24"/>
-        </w:rPr>
         <w:t>preserves both the working directory and staging area</w:t>
       </w:r>
       <w:r>
@@ -6779,6 +6771,7 @@
           <w:sz w:val="20"/>
           <w:szCs w:val="20"/>
         </w:rPr>
+        <w:lastRenderedPageBreak/>
         <w:t>--soft</w:t>
       </w:r>
       <w:r>
@@ -7700,7 +7693,6 @@
         <w:pStyle w:val="Heading1"/>
       </w:pPr>
       <w:r>
-        <w:lastRenderedPageBreak/>
         <w:t>Issue-Based Development, Tag, Release and Final Evidence</w:t>
       </w:r>
     </w:p>
@@ -7729,6 +7721,7 @@
           <w:rFonts w:ascii="Consolas" w:hAnsi="Consolas"/>
           <w:sz w:val="18"/>
         </w:rPr>
+        <w:lastRenderedPageBreak/>
         <w:t>git</w:t>
       </w:r>
       <w:proofErr w:type="spellEnd"/>
@@ -8197,7 +8190,6 @@
           <w:rFonts w:ascii="Consolas" w:hAnsi="Consolas"/>
           <w:sz w:val="18"/>
         </w:rPr>
-        <w:lastRenderedPageBreak/>
         <w:t>git</w:t>
       </w:r>
       <w:proofErr w:type="spellEnd"/>
@@ -8296,6 +8288,7 @@
     </w:p>
     <w:p>
       <w:r>
+        <w:lastRenderedPageBreak/>
         <w:t>Show meaningful commit history and branches.</w:t>
       </w:r>
     </w:p>
@@ -8736,7 +8729,6 @@
             </w:pPr>
             <w:proofErr w:type="spellStart"/>
             <w:r>
-              <w:lastRenderedPageBreak/>
               <w:t>git</w:t>
             </w:r>
             <w:proofErr w:type="spellEnd"/>
@@ -8946,6 +8938,7 @@
             </w:pPr>
             <w:proofErr w:type="spellStart"/>
             <w:r>
+              <w:lastRenderedPageBreak/>
               <w:t>git</w:t>
             </w:r>
             <w:proofErr w:type="spellEnd"/>
@@ -10013,14 +10006,15 @@
           <w:sz w:val="18"/>
         </w:rPr>
         <w:br/>
+        <w:t>Add task completion</w:t>
       </w:r>
       <w:r>
         <w:rPr>
           <w:rFonts w:ascii="Consolas" w:hAnsi="Consolas"/>
           <w:sz w:val="18"/>
         </w:rPr>
-        <w:lastRenderedPageBreak/>
-        <w:t>Add task completion</w:t>
+        <w:br/>
+        <w:t>Add task search</w:t>
       </w:r>
       <w:r>
         <w:rPr>
@@ -10028,7 +10022,7 @@
           <w:sz w:val="18"/>
         </w:rPr>
         <w:br/>
-        <w:t>Add task search</w:t>
+        <w:t>Update project documentation</w:t>
       </w:r>
       <w:r>
         <w:rPr>
@@ -10036,7 +10030,7 @@
           <w:sz w:val="18"/>
         </w:rPr>
         <w:br/>
-        <w:t>Update project documentation</w:t>
+        <w:t>Fix responsive layout</w:t>
       </w:r>
       <w:r>
         <w:rPr>
@@ -10044,19 +10038,12 @@
           <w:sz w:val="18"/>
         </w:rPr>
         <w:br/>
-        <w:t>Fix responsive layout</w:t>
-      </w:r>
-      <w:r>
-        <w:rPr>
-          <w:rFonts w:ascii="Consolas" w:hAnsi="Consolas"/>
-          <w:sz w:val="18"/>
-        </w:rPr>
-        <w:br/>
         <w:t>Prepare version 1.0 release</w:t>
       </w:r>
     </w:p>
     <w:p>
       <w:r>
+        <w:lastRenderedPageBreak/>
         <w:t xml:space="preserve">Avoid meaningless messages such as: changes, update, final, </w:t>
       </w:r>
       <w:proofErr w:type="spellStart"/>
@@ -10657,7 +10644,6 @@
         <w:rPr>
           <w:rFonts w:hAnsi="Symbol"/>
         </w:rPr>
-        <w:lastRenderedPageBreak/>
         <w:t></w:t>
       </w:r>
       <w:r>
@@ -10696,6 +10682,7 @@
     <w:p/>
     <w:p>
       <w:r>
+        <w:lastRenderedPageBreak/>
         <w:t>Q5. Why should developers normally create feature branches instead of making every change directly on main?</w:t>
       </w:r>
     </w:p>
@@ -11102,30 +11089,30 @@
         <w:rPr>
           <w:rFonts w:hAnsi="Symbol"/>
         </w:rPr>
+        <w:t></w:t>
+      </w:r>
+      <w:r>
+        <w:t xml:space="preserve">  Enables</w:t>
+      </w:r>
+      <w:proofErr w:type="gramEnd"/>
+      <w:r>
+        <w:t xml:space="preserve"> automated changelog generation and structured release tracking.</w:t>
+      </w:r>
+    </w:p>
+    <w:p>
+      <w:pPr>
+        <w:pStyle w:val="NormalWeb"/>
+      </w:pPr>
+      <w:r>
+        <w:t>Q10. What problems did you encounter during this assignment and how did you solve them?</w:t>
+      </w:r>
+    </w:p>
+    <w:p>
+      <w:pPr>
+        <w:pStyle w:val="NormalWeb"/>
+      </w:pPr>
+      <w:r>
         <w:lastRenderedPageBreak/>
-        <w:t></w:t>
-      </w:r>
-      <w:r>
-        <w:t xml:space="preserve">  Enables</w:t>
-      </w:r>
-      <w:proofErr w:type="gramEnd"/>
-      <w:r>
-        <w:t xml:space="preserve"> automated changelog generation and structured release tracking.</w:t>
-      </w:r>
-    </w:p>
-    <w:p>
-      <w:pPr>
-        <w:pStyle w:val="NormalWeb"/>
-      </w:pPr>
-      <w:r>
-        <w:t>Q10. What problems did you encounter during this assignment and how did you solve them?</w:t>
-      </w:r>
-    </w:p>
-    <w:p>
-      <w:pPr>
-        <w:pStyle w:val="NormalWeb"/>
-      </w:pPr>
-      <w:r>
         <w:t xml:space="preserve">Answer: </w:t>
       </w:r>
       <w:proofErr w:type="gramStart"/>
@@ -11303,7 +11290,7 @@
       <w:pPr>
         <w:spacing w:after="0"/>
         <w:sectPr>
-          <w:footerReference w:type="default" r:id="rId40"/>
+          <w:footerReference w:type="default" r:id="rId42"/>
           <w:pgSz w:w="12240" w:h="15840"/>
           <w:pgMar w:top="720" w:right="720" w:bottom="720" w:left="720" w:header="720" w:footer="720" w:gutter="0"/>
           <w:cols w:space="720"/>
@@ -25789,7 +25776,7 @@
 </file>
 
 <file path=customXml/itemProps1.xml><?xml version="1.0" encoding="utf-8"?>
-<ds:datastoreItem xmlns:ds="http://schemas.openxmlformats.org/officeDocument/2006/customXml" ds:itemID="{F1588178-374B-406B-919C-6B0563E829B6}">
+<ds:datastoreItem xmlns:ds="http://schemas.openxmlformats.org/officeDocument/2006/customXml" ds:itemID="{F1865A1D-05D7-4DEB-8B99-2CAFBF241A36}">
   <ds:schemaRefs>
     <ds:schemaRef ds:uri="http://schemas.openxmlformats.org/officeDocument/2006/bibliography"/>
   </ds:schemaRefs>

</xml_diff>

<commit_message>
updated final assgn v1.1
</commit_message>
<xml_diff>
--- a/Git-GitHub-Assignment_MSDSF26M012_MSDSF25A007.docx
+++ b/Git-GitHub-Assignment_MSDSF26M012_MSDSF25A007.docx
@@ -5807,8 +5807,6 @@
           </wp:inline>
         </w:drawing>
       </w:r>
-      <w:bookmarkStart w:id="0" w:name="_GoBack"/>
-      <w:bookmarkEnd w:id="0"/>
       <w:r>
         <w:rPr>
           <w:i/>
@@ -6192,55 +6190,52 @@
         <w:t>Show the temporary commit and the result of the soft reset.</w:t>
       </w:r>
     </w:p>
-    <w:tbl>
-      <w:tblPr>
-        <w:tblW w:w="0" w:type="auto"/>
+    <w:p>
+      <w:pPr>
         <w:jc w:val="center"/>
-        <w:tblLook w:val="04A0" w:firstRow="1" w:lastRow="0" w:firstColumn="1" w:lastColumn="0" w:noHBand="0" w:noVBand="1"/>
-      </w:tblPr>
-      <w:tblGrid>
-        <w:gridCol w:w="10080"/>
-      </w:tblGrid>
-      <w:tr>
-        <w:trPr>
-          <w:jc w:val="center"/>
-        </w:trPr>
-        <w:tc>
-          <w:tcPr>
-            <w:tcW w:w="10080" w:type="dxa"/>
-            <w:shd w:val="clear" w:color="auto" w:fill="EDEDED"/>
-          </w:tcPr>
-          <w:p>
-            <w:pPr>
-              <w:jc w:val="center"/>
-            </w:pPr>
-            <w:r>
-              <w:rPr>
-                <w:sz w:val="18"/>
-              </w:rPr>
-              <w:t>[Insert Screenshot 29 here]</w:t>
-            </w:r>
-            <w:r>
-              <w:rPr>
-                <w:sz w:val="18"/>
-              </w:rPr>
-              <w:br/>
-            </w:r>
-            <w:r>
-              <w:rPr>
-                <w:sz w:val="18"/>
-              </w:rPr>
-              <w:br/>
-              <w:t>Evidence / output should be clearly visible.</w:t>
-            </w:r>
-          </w:p>
-        </w:tc>
-      </w:tr>
-    </w:tbl>
-    <w:p>
-      <w:pPr>
-        <w:jc w:val="center"/>
-      </w:pPr>
+      </w:pPr>
+      <w:r>
+        <w:rPr>
+          <w:i/>
+        </w:rPr>
+        <w:drawing>
+          <wp:inline distT="0" distB="0" distL="0" distR="0" wp14:anchorId="5051AC4D" wp14:editId="012EAC83">
+            <wp:extent cx="6858000" cy="4018280"/>
+            <wp:effectExtent l="0" t="0" r="0" b="1270"/>
+            <wp:docPr id="22" name="Picture 22"/>
+            <wp:cNvGraphicFramePr>
+              <a:graphicFrameLocks xmlns:a="http://schemas.openxmlformats.org/drawingml/2006/main" noChangeAspect="1"/>
+            </wp:cNvGraphicFramePr>
+            <a:graphic xmlns:a="http://schemas.openxmlformats.org/drawingml/2006/main">
+              <a:graphicData uri="http://schemas.openxmlformats.org/drawingml/2006/picture">
+                <pic:pic xmlns:pic="http://schemas.openxmlformats.org/drawingml/2006/picture">
+                  <pic:nvPicPr>
+                    <pic:cNvPr id="1" name=""/>
+                    <pic:cNvPicPr/>
+                  </pic:nvPicPr>
+                  <pic:blipFill>
+                    <a:blip r:embed="rId42"/>
+                    <a:stretch>
+                      <a:fillRect/>
+                    </a:stretch>
+                  </pic:blipFill>
+                  <pic:spPr>
+                    <a:xfrm>
+                      <a:off x="0" y="0"/>
+                      <a:ext cx="6858000" cy="4018280"/>
+                    </a:xfrm>
+                    <a:prstGeom prst="rect">
+                      <a:avLst/>
+                    </a:prstGeom>
+                  </pic:spPr>
+                </pic:pic>
+              </a:graphicData>
+            </a:graphic>
+          </wp:inline>
+        </w:drawing>
+      </w:r>
+      <w:bookmarkStart w:id="0" w:name="_GoBack"/>
+      <w:bookmarkEnd w:id="0"/>
       <w:r>
         <w:rPr>
           <w:i/>
@@ -6341,6 +6336,7 @@
           <w:sz w:val="24"/>
           <w:szCs w:val="24"/>
         </w:rPr>
+        <w:lastRenderedPageBreak/>
         <w:t xml:space="preserve">The </w:t>
       </w:r>
       <w:r>
@@ -6771,7 +6767,6 @@
           <w:sz w:val="20"/>
           <w:szCs w:val="20"/>
         </w:rPr>
-        <w:lastRenderedPageBreak/>
         <w:t>--soft</w:t>
       </w:r>
       <w:r>
@@ -7289,6 +7284,7 @@
                 <w:b/>
                 <w:bCs/>
               </w:rPr>
+              <w:lastRenderedPageBreak/>
               <w:t>Aspect</w:t>
             </w:r>
           </w:p>
@@ -7721,7 +7717,6 @@
           <w:rFonts w:ascii="Consolas" w:hAnsi="Consolas"/>
           <w:sz w:val="18"/>
         </w:rPr>
-        <w:lastRenderedPageBreak/>
         <w:t>git</w:t>
       </w:r>
       <w:proofErr w:type="spellEnd"/>
@@ -8031,6 +8026,7 @@
               <w:rPr>
                 <w:sz w:val="18"/>
               </w:rPr>
+              <w:lastRenderedPageBreak/>
               <w:t>[Insert Screenshot 32 here]</w:t>
             </w:r>
             <w:r>
@@ -8288,7 +8284,6 @@
     </w:p>
     <w:p>
       <w:r>
-        <w:lastRenderedPageBreak/>
         <w:t>Show meaningful commit history and branches.</w:t>
       </w:r>
     </w:p>
@@ -8539,6 +8534,7 @@
               <w:rPr>
                 <w:sz w:val="18"/>
               </w:rPr>
+              <w:lastRenderedPageBreak/>
               <w:t>[Insert Screenshot 37 here]</w:t>
             </w:r>
             <w:r>
@@ -8938,7 +8934,6 @@
             </w:pPr>
             <w:proofErr w:type="spellStart"/>
             <w:r>
-              <w:lastRenderedPageBreak/>
               <w:t>git</w:t>
             </w:r>
             <w:proofErr w:type="spellEnd"/>
@@ -9858,6 +9853,7 @@
         <w:pStyle w:val="ListBullet"/>
       </w:pPr>
       <w:r>
+        <w:lastRenderedPageBreak/>
         <w:t>Features</w:t>
       </w:r>
     </w:p>
@@ -10043,7 +10039,6 @@
     </w:p>
     <w:p>
       <w:r>
-        <w:lastRenderedPageBreak/>
         <w:t xml:space="preserve">Avoid meaningless messages such as: changes, update, final, </w:t>
       </w:r>
       <w:proofErr w:type="spellStart"/>
@@ -10341,6 +10336,7 @@
         <w:rPr>
           <w:rFonts w:hAnsi="Symbol"/>
         </w:rPr>
+        <w:lastRenderedPageBreak/>
         <w:t></w:t>
       </w:r>
       <w:r>
@@ -10682,8 +10678,241 @@
     <w:p/>
     <w:p>
       <w:r>
+        <w:t>Q5. Why should developers normally create feature branches instead of making every change directly on main?</w:t>
+      </w:r>
+    </w:p>
+    <w:p>
+      <w:pPr>
+        <w:pStyle w:val="NormalWeb"/>
+      </w:pPr>
+      <w:r>
+        <w:t>Answer:</w:t>
+      </w:r>
+      <w:r>
+        <w:t xml:space="preserve"> </w:t>
+      </w:r>
+      <w:proofErr w:type="gramStart"/>
+      <w:r>
+        <w:rPr>
+          <w:rFonts w:hAnsi="Symbol"/>
+        </w:rPr>
+        <w:t></w:t>
+      </w:r>
+      <w:r>
+        <w:t xml:space="preserve">  Isolates</w:t>
+      </w:r>
+      <w:proofErr w:type="gramEnd"/>
+      <w:r>
+        <w:t xml:space="preserve"> in-progress features, experiments, or bug fixes without destabilizing production code on </w:t>
+      </w:r>
+      <w:r>
+        <w:rPr>
+          <w:rStyle w:val="HTMLCode"/>
+        </w:rPr>
+        <w:t>main</w:t>
+      </w:r>
+      <w:r>
+        <w:t>.</w:t>
+      </w:r>
+    </w:p>
+    <w:p>
+      <w:pPr>
+        <w:pStyle w:val="NormalWeb"/>
+      </w:pPr>
+      <w:proofErr w:type="gramStart"/>
+      <w:r>
+        <w:rPr>
+          <w:rFonts w:hAnsi="Symbol"/>
+        </w:rPr>
+        <w:t></w:t>
+      </w:r>
+      <w:r>
+        <w:t xml:space="preserve">  Enables</w:t>
+      </w:r>
+      <w:proofErr w:type="gramEnd"/>
+      <w:r>
+        <w:t xml:space="preserve"> team collaboration via Pull Requests, peer code reviews, and automated CI/CD checks before code merges.</w:t>
+      </w:r>
+    </w:p>
+    <w:p>
+      <w:pPr>
+        <w:pStyle w:val="NormalWeb"/>
+      </w:pPr>
+      <w:proofErr w:type="gramStart"/>
+      <w:r>
+        <w:rPr>
+          <w:rFonts w:hAnsi="Symbol"/>
+        </w:rPr>
+        <w:t></w:t>
+      </w:r>
+      <w:r>
+        <w:t xml:space="preserve">  Permits</w:t>
+      </w:r>
+      <w:proofErr w:type="gramEnd"/>
+      <w:r>
+        <w:t xml:space="preserve"> multiple developers to work concurrently on distinct features without colliding in active working branches.</w:t>
+      </w:r>
+    </w:p>
+    <w:p/>
+    <w:p>
+      <w:r>
+        <w:t xml:space="preserve">Q6. What causes a </w:t>
+      </w:r>
+      <w:proofErr w:type="spellStart"/>
+      <w:r>
+        <w:t>Git</w:t>
+      </w:r>
+      <w:proofErr w:type="spellEnd"/>
+      <w:r>
+        <w:t xml:space="preserve"> merge conflict?</w:t>
+      </w:r>
+    </w:p>
+    <w:p>
+      <w:r>
+        <w:t xml:space="preserve">Answer: </w:t>
+      </w:r>
+      <w:r>
+        <w:t xml:space="preserve">A merge conflict occurs when two branches modify the exact same lines of code within a file differently, or when one branch deletes a file that another branch edits, preventing </w:t>
+      </w:r>
+      <w:proofErr w:type="spellStart"/>
+      <w:r>
+        <w:t>Git</w:t>
+      </w:r>
+      <w:proofErr w:type="spellEnd"/>
+      <w:r>
+        <w:t xml:space="preserve"> from resolving the differences automatically.</w:t>
+      </w:r>
+    </w:p>
+    <w:p>
+      <w:r>
+        <w:t>Q7. How did you resolve your merge conflict?</w:t>
+      </w:r>
+    </w:p>
+    <w:p>
+      <w:pPr>
+        <w:pStyle w:val="NormalWeb"/>
+      </w:pPr>
+      <w:r>
+        <w:t xml:space="preserve">Answer: </w:t>
+      </w:r>
+      <w:proofErr w:type="gramStart"/>
+      <w:r>
+        <w:rPr>
+          <w:rFonts w:hAnsi="Symbol"/>
+        </w:rPr>
+        <w:t></w:t>
+      </w:r>
+      <w:r>
+        <w:t xml:space="preserve">  Opened</w:t>
+      </w:r>
+      <w:proofErr w:type="gramEnd"/>
+      <w:r>
+        <w:t xml:space="preserve"> the conflicting file(s) containing conflict markers (</w:t>
+      </w:r>
+      <w:r>
+        <w:rPr>
+          <w:rStyle w:val="HTMLCode"/>
+        </w:rPr>
+        <w:t>&lt;&lt;&lt;&lt;&lt;&lt;&lt;</w:t>
+      </w:r>
+      <w:r>
+        <w:t xml:space="preserve">, </w:t>
+      </w:r>
+      <w:r>
+        <w:rPr>
+          <w:rStyle w:val="HTMLCode"/>
+        </w:rPr>
+        <w:t>=======</w:t>
+      </w:r>
+      <w:r>
+        <w:t xml:space="preserve">, </w:t>
+      </w:r>
+      <w:r>
+        <w:rPr>
+          <w:rStyle w:val="HTMLCode"/>
+        </w:rPr>
+        <w:t>&gt;&gt;&gt;&gt;&gt;&gt;&gt;</w:t>
+      </w:r>
+      <w:r>
+        <w:t>).</w:t>
+      </w:r>
+    </w:p>
+    <w:p>
+      <w:pPr>
+        <w:pStyle w:val="NormalWeb"/>
+      </w:pPr>
+      <w:proofErr w:type="gramStart"/>
+      <w:r>
+        <w:rPr>
+          <w:rFonts w:hAnsi="Symbol"/>
+        </w:rPr>
+        <w:t></w:t>
+      </w:r>
+      <w:r>
+        <w:t xml:space="preserve">  Discussed</w:t>
+      </w:r>
+      <w:proofErr w:type="gramEnd"/>
+      <w:r>
+        <w:t xml:space="preserve"> changes with the collaborator, edited the conflicting sections to combine the correct logic, and removed all conflict marker tags.</w:t>
+      </w:r>
+    </w:p>
+    <w:p>
+      <w:pPr>
+        <w:pStyle w:val="NormalWeb"/>
+      </w:pPr>
+      <w:proofErr w:type="gramStart"/>
+      <w:r>
+        <w:rPr>
+          <w:rFonts w:hAnsi="Symbol"/>
+        </w:rPr>
         <w:lastRenderedPageBreak/>
-        <w:t>Q5. Why should developers normally create feature branches instead of making every change directly on main?</w:t>
+        <w:t></w:t>
+      </w:r>
+      <w:r>
+        <w:t xml:space="preserve">  Staged</w:t>
+      </w:r>
+      <w:proofErr w:type="gramEnd"/>
+      <w:r>
+        <w:t xml:space="preserve"> the resolved files using </w:t>
+      </w:r>
+      <w:proofErr w:type="spellStart"/>
+      <w:r>
+        <w:rPr>
+          <w:rStyle w:val="HTMLCode"/>
+        </w:rPr>
+        <w:t>git</w:t>
+      </w:r>
+      <w:proofErr w:type="spellEnd"/>
+      <w:r>
+        <w:rPr>
+          <w:rStyle w:val="HTMLCode"/>
+        </w:rPr>
+        <w:t xml:space="preserve"> add &lt;file&gt;</w:t>
+      </w:r>
+      <w:r>
+        <w:t xml:space="preserve"> and completed the merge via </w:t>
+      </w:r>
+      <w:proofErr w:type="spellStart"/>
+      <w:r>
+        <w:rPr>
+          <w:rStyle w:val="HTMLCode"/>
+        </w:rPr>
+        <w:t>git</w:t>
+      </w:r>
+      <w:proofErr w:type="spellEnd"/>
+      <w:r>
+        <w:rPr>
+          <w:rStyle w:val="HTMLCode"/>
+        </w:rPr>
+        <w:t xml:space="preserve"> commit</w:t>
+      </w:r>
+      <w:r>
+        <w:t xml:space="preserve"> before pushing to GitHub.</w:t>
+      </w:r>
+    </w:p>
+    <w:p>
+      <w:r>
+        <w:t>Q8. Why is a Pull Request useful?</w:t>
       </w:r>
     </w:p>
     <w:p>
@@ -10704,17 +10933,144 @@
         <w:t></w:t>
       </w:r>
       <w:r>
-        <w:t xml:space="preserve">  Isolates</w:t>
+        <w:t xml:space="preserve">  Provides</w:t>
       </w:r>
       <w:proofErr w:type="gramEnd"/>
       <w:r>
-        <w:t xml:space="preserve"> in-progress features, experiments, or bug fixes without destabilizing production code on </w:t>
-      </w:r>
+        <w:t xml:space="preserve"> a formal code review mechanism to verify code quality, structure, and functionality prior to merging into production branches.</w:t>
+      </w:r>
+    </w:p>
+    <w:p>
+      <w:pPr>
+        <w:pStyle w:val="NormalWeb"/>
+      </w:pPr>
+      <w:proofErr w:type="gramStart"/>
+      <w:r>
+        <w:rPr>
+          <w:rFonts w:hAnsi="Symbol"/>
+        </w:rPr>
+        <w:t></w:t>
+      </w:r>
+      <w:r>
+        <w:t xml:space="preserve">  Facilitates</w:t>
+      </w:r>
+      <w:proofErr w:type="gramEnd"/>
+      <w:r>
+        <w:t xml:space="preserve"> team discussion, inline commenting, and automated integration checks.</w:t>
+      </w:r>
+    </w:p>
+    <w:p>
+      <w:pPr>
+        <w:pStyle w:val="NormalWeb"/>
+      </w:pPr>
+      <w:proofErr w:type="gramStart"/>
+      <w:r>
+        <w:rPr>
+          <w:rFonts w:hAnsi="Symbol"/>
+        </w:rPr>
+        <w:t></w:t>
+      </w:r>
+      <w:r>
+        <w:t xml:space="preserve">  Documents</w:t>
+      </w:r>
+      <w:proofErr w:type="gramEnd"/>
+      <w:r>
+        <w:t xml:space="preserve"> architectural decisions and historical context tied to specific feature branches.</w:t>
+      </w:r>
+    </w:p>
+    <w:p>
+      <w:r>
+        <w:t>Q9. Why should commit messages be meaningful?</w:t>
+      </w:r>
+    </w:p>
+    <w:p>
+      <w:pPr>
+        <w:pStyle w:val="NormalWeb"/>
+      </w:pPr>
+      <w:r>
+        <w:t>Answer:</w:t>
+      </w:r>
+      <w:r>
+        <w:rPr>
+          <w:rFonts w:hAnsi="Symbol"/>
+        </w:rPr>
+        <w:t xml:space="preserve"> </w:t>
+      </w:r>
+      <w:proofErr w:type="gramStart"/>
+      <w:r>
+        <w:rPr>
+          <w:rFonts w:hAnsi="Symbol"/>
+        </w:rPr>
+        <w:t></w:t>
+      </w:r>
+      <w:r>
+        <w:t xml:space="preserve">  Communicates</w:t>
+      </w:r>
+      <w:proofErr w:type="gramEnd"/>
+      <w:r>
+        <w:t xml:space="preserve"> the specific intent and business logic behind changes to collaborators and future maintainers.</w:t>
+      </w:r>
+    </w:p>
+    <w:p>
+      <w:pPr>
+        <w:pStyle w:val="NormalWeb"/>
+      </w:pPr>
+      <w:r>
+        <w:rPr>
+          <w:rFonts w:hAnsi="Symbol"/>
+        </w:rPr>
+        <w:t></w:t>
+      </w:r>
+      <w:r>
+        <w:t xml:space="preserve">  Accelerates debugging and code auditing when inspecting history using commands like </w:t>
+      </w:r>
+      <w:proofErr w:type="spellStart"/>
       <w:r>
         <w:rPr>
           <w:rStyle w:val="HTMLCode"/>
         </w:rPr>
-        <w:t>main</w:t>
+        <w:t>git</w:t>
+      </w:r>
+      <w:proofErr w:type="spellEnd"/>
+      <w:r>
+        <w:rPr>
+          <w:rStyle w:val="HTMLCode"/>
+        </w:rPr>
+        <w:t xml:space="preserve"> log</w:t>
+      </w:r>
+      <w:r>
+        <w:t xml:space="preserve">, </w:t>
+      </w:r>
+      <w:proofErr w:type="spellStart"/>
+      <w:r>
+        <w:rPr>
+          <w:rStyle w:val="HTMLCode"/>
+        </w:rPr>
+        <w:t>git</w:t>
+      </w:r>
+      <w:proofErr w:type="spellEnd"/>
+      <w:r>
+        <w:rPr>
+          <w:rStyle w:val="HTMLCode"/>
+        </w:rPr>
+        <w:t xml:space="preserve"> blame</w:t>
+      </w:r>
+      <w:r>
+        <w:t xml:space="preserve">, and </w:t>
+      </w:r>
+      <w:proofErr w:type="spellStart"/>
+      <w:r>
+        <w:rPr>
+          <w:rStyle w:val="HTMLCode"/>
+        </w:rPr>
+        <w:t>git</w:t>
+      </w:r>
+      <w:proofErr w:type="spellEnd"/>
+      <w:r>
+        <w:rPr>
+          <w:rStyle w:val="HTMLCode"/>
+        </w:rPr>
+        <w:t xml:space="preserve"> bisect</w:t>
       </w:r>
       <w:r>
         <w:t>.</w:t>
@@ -10736,61 +11092,15 @@
       </w:r>
       <w:proofErr w:type="gramEnd"/>
       <w:r>
-        <w:t xml:space="preserve"> team collaboration via Pull Requests, peer code reviews, and automated CI/CD checks before code merges.</w:t>
+        <w:t xml:space="preserve"> automated changelog generation and structured release tracking.</w:t>
       </w:r>
     </w:p>
     <w:p>
       <w:pPr>
         <w:pStyle w:val="NormalWeb"/>
       </w:pPr>
-      <w:proofErr w:type="gramStart"/>
-      <w:r>
-        <w:rPr>
-          <w:rFonts w:hAnsi="Symbol"/>
-        </w:rPr>
-        <w:t></w:t>
-      </w:r>
-      <w:r>
-        <w:t xml:space="preserve">  Permits</w:t>
-      </w:r>
-      <w:proofErr w:type="gramEnd"/>
-      <w:r>
-        <w:t xml:space="preserve"> multiple developers to work concurrently on distinct features without colliding in active working branches.</w:t>
-      </w:r>
-    </w:p>
-    <w:p/>
-    <w:p>
-      <w:r>
-        <w:t xml:space="preserve">Q6. What causes a </w:t>
-      </w:r>
-      <w:proofErr w:type="spellStart"/>
-      <w:r>
-        <w:t>Git</w:t>
-      </w:r>
-      <w:proofErr w:type="spellEnd"/>
-      <w:r>
-        <w:t xml:space="preserve"> merge conflict?</w:t>
-      </w:r>
-    </w:p>
-    <w:p>
-      <w:r>
-        <w:t xml:space="preserve">Answer: </w:t>
-      </w:r>
-      <w:r>
-        <w:t xml:space="preserve">A merge conflict occurs when two branches modify the exact same lines of code within a file differently, or when one branch deletes a file that another branch edits, preventing </w:t>
-      </w:r>
-      <w:proofErr w:type="spellStart"/>
-      <w:r>
-        <w:t>Git</w:t>
-      </w:r>
-      <w:proofErr w:type="spellEnd"/>
-      <w:r>
-        <w:t xml:space="preserve"> from resolving the differences automatically.</w:t>
-      </w:r>
-    </w:p>
-    <w:p>
-      <w:r>
-        <w:t>Q7. How did you resolve your merge conflict?</w:t>
+      <w:r>
+        <w:t>Q10. What problems did you encounter during this assignment and how did you solve them?</w:t>
       </w:r>
     </w:p>
     <w:p>
@@ -10798,321 +11108,6 @@
         <w:pStyle w:val="NormalWeb"/>
       </w:pPr>
       <w:r>
-        <w:t xml:space="preserve">Answer: </w:t>
-      </w:r>
-      <w:proofErr w:type="gramStart"/>
-      <w:r>
-        <w:rPr>
-          <w:rFonts w:hAnsi="Symbol"/>
-        </w:rPr>
-        <w:t></w:t>
-      </w:r>
-      <w:r>
-        <w:t xml:space="preserve">  Opened</w:t>
-      </w:r>
-      <w:proofErr w:type="gramEnd"/>
-      <w:r>
-        <w:t xml:space="preserve"> the conflicting file(s) containing conflict markers (</w:t>
-      </w:r>
-      <w:r>
-        <w:rPr>
-          <w:rStyle w:val="HTMLCode"/>
-        </w:rPr>
-        <w:t>&lt;&lt;&lt;&lt;&lt;&lt;&lt;</w:t>
-      </w:r>
-      <w:r>
-        <w:t xml:space="preserve">, </w:t>
-      </w:r>
-      <w:r>
-        <w:rPr>
-          <w:rStyle w:val="HTMLCode"/>
-        </w:rPr>
-        <w:t>=======</w:t>
-      </w:r>
-      <w:r>
-        <w:t xml:space="preserve">, </w:t>
-      </w:r>
-      <w:r>
-        <w:rPr>
-          <w:rStyle w:val="HTMLCode"/>
-        </w:rPr>
-        <w:t>&gt;&gt;&gt;&gt;&gt;&gt;&gt;</w:t>
-      </w:r>
-      <w:r>
-        <w:t>).</w:t>
-      </w:r>
-    </w:p>
-    <w:p>
-      <w:pPr>
-        <w:pStyle w:val="NormalWeb"/>
-      </w:pPr>
-      <w:proofErr w:type="gramStart"/>
-      <w:r>
-        <w:rPr>
-          <w:rFonts w:hAnsi="Symbol"/>
-        </w:rPr>
-        <w:t></w:t>
-      </w:r>
-      <w:r>
-        <w:t xml:space="preserve">  Discussed</w:t>
-      </w:r>
-      <w:proofErr w:type="gramEnd"/>
-      <w:r>
-        <w:t xml:space="preserve"> changes with the collaborator, edited the conflicting sections to combine the correct logic, and removed all conflict marker tags.</w:t>
-      </w:r>
-    </w:p>
-    <w:p>
-      <w:pPr>
-        <w:pStyle w:val="NormalWeb"/>
-      </w:pPr>
-      <w:proofErr w:type="gramStart"/>
-      <w:r>
-        <w:rPr>
-          <w:rFonts w:hAnsi="Symbol"/>
-        </w:rPr>
-        <w:t></w:t>
-      </w:r>
-      <w:r>
-        <w:t xml:space="preserve">  Staged</w:t>
-      </w:r>
-      <w:proofErr w:type="gramEnd"/>
-      <w:r>
-        <w:t xml:space="preserve"> the resolved files using </w:t>
-      </w:r>
-      <w:proofErr w:type="spellStart"/>
-      <w:r>
-        <w:rPr>
-          <w:rStyle w:val="HTMLCode"/>
-        </w:rPr>
-        <w:t>git</w:t>
-      </w:r>
-      <w:proofErr w:type="spellEnd"/>
-      <w:r>
-        <w:rPr>
-          <w:rStyle w:val="HTMLCode"/>
-        </w:rPr>
-        <w:t xml:space="preserve"> add &lt;file&gt;</w:t>
-      </w:r>
-      <w:r>
-        <w:t xml:space="preserve"> and completed the merge via </w:t>
-      </w:r>
-      <w:proofErr w:type="spellStart"/>
-      <w:r>
-        <w:rPr>
-          <w:rStyle w:val="HTMLCode"/>
-        </w:rPr>
-        <w:t>git</w:t>
-      </w:r>
-      <w:proofErr w:type="spellEnd"/>
-      <w:r>
-        <w:rPr>
-          <w:rStyle w:val="HTMLCode"/>
-        </w:rPr>
-        <w:t xml:space="preserve"> commit</w:t>
-      </w:r>
-      <w:r>
-        <w:t xml:space="preserve"> before pushing to GitHub.</w:t>
-      </w:r>
-    </w:p>
-    <w:p>
-      <w:r>
-        <w:t>Q8. Why is a Pull Request useful?</w:t>
-      </w:r>
-    </w:p>
-    <w:p>
-      <w:pPr>
-        <w:pStyle w:val="NormalWeb"/>
-      </w:pPr>
-      <w:r>
-        <w:t>Answer:</w:t>
-      </w:r>
-      <w:r>
-        <w:t xml:space="preserve"> </w:t>
-      </w:r>
-      <w:proofErr w:type="gramStart"/>
-      <w:r>
-        <w:rPr>
-          <w:rFonts w:hAnsi="Symbol"/>
-        </w:rPr>
-        <w:t></w:t>
-      </w:r>
-      <w:r>
-        <w:t xml:space="preserve">  Provides</w:t>
-      </w:r>
-      <w:proofErr w:type="gramEnd"/>
-      <w:r>
-        <w:t xml:space="preserve"> a formal code review mechanism to verify code quality, structure, and functionality prior to merging into production branches.</w:t>
-      </w:r>
-    </w:p>
-    <w:p>
-      <w:pPr>
-        <w:pStyle w:val="NormalWeb"/>
-      </w:pPr>
-      <w:proofErr w:type="gramStart"/>
-      <w:r>
-        <w:rPr>
-          <w:rFonts w:hAnsi="Symbol"/>
-        </w:rPr>
-        <w:t></w:t>
-      </w:r>
-      <w:r>
-        <w:t xml:space="preserve">  Facilitates</w:t>
-      </w:r>
-      <w:proofErr w:type="gramEnd"/>
-      <w:r>
-        <w:t xml:space="preserve"> team discussion, inline commenting, and automated integration checks.</w:t>
-      </w:r>
-    </w:p>
-    <w:p>
-      <w:pPr>
-        <w:pStyle w:val="NormalWeb"/>
-      </w:pPr>
-      <w:proofErr w:type="gramStart"/>
-      <w:r>
-        <w:rPr>
-          <w:rFonts w:hAnsi="Symbol"/>
-        </w:rPr>
-        <w:t></w:t>
-      </w:r>
-      <w:r>
-        <w:t xml:space="preserve">  Documents</w:t>
-      </w:r>
-      <w:proofErr w:type="gramEnd"/>
-      <w:r>
-        <w:t xml:space="preserve"> architectural decisions and historical context tied to specific feature branches.</w:t>
-      </w:r>
-    </w:p>
-    <w:p>
-      <w:r>
-        <w:t>Q9. Why should commit messages be meaningful?</w:t>
-      </w:r>
-    </w:p>
-    <w:p>
-      <w:pPr>
-        <w:pStyle w:val="NormalWeb"/>
-      </w:pPr>
-      <w:r>
-        <w:t>Answer:</w:t>
-      </w:r>
-      <w:r>
-        <w:rPr>
-          <w:rFonts w:hAnsi="Symbol"/>
-        </w:rPr>
-        <w:t xml:space="preserve"> </w:t>
-      </w:r>
-      <w:proofErr w:type="gramStart"/>
-      <w:r>
-        <w:rPr>
-          <w:rFonts w:hAnsi="Symbol"/>
-        </w:rPr>
-        <w:t></w:t>
-      </w:r>
-      <w:r>
-        <w:t xml:space="preserve">  Communicates</w:t>
-      </w:r>
-      <w:proofErr w:type="gramEnd"/>
-      <w:r>
-        <w:t xml:space="preserve"> the specific intent and business logic behind changes to collaborators and future maintainers.</w:t>
-      </w:r>
-    </w:p>
-    <w:p>
-      <w:pPr>
-        <w:pStyle w:val="NormalWeb"/>
-      </w:pPr>
-      <w:r>
-        <w:rPr>
-          <w:rFonts w:hAnsi="Symbol"/>
-        </w:rPr>
-        <w:t></w:t>
-      </w:r>
-      <w:r>
-        <w:t xml:space="preserve">  Accelerates debugging and code auditing when inspecting history using commands like </w:t>
-      </w:r>
-      <w:proofErr w:type="spellStart"/>
-      <w:r>
-        <w:rPr>
-          <w:rStyle w:val="HTMLCode"/>
-        </w:rPr>
-        <w:t>git</w:t>
-      </w:r>
-      <w:proofErr w:type="spellEnd"/>
-      <w:r>
-        <w:rPr>
-          <w:rStyle w:val="HTMLCode"/>
-        </w:rPr>
-        <w:t xml:space="preserve"> log</w:t>
-      </w:r>
-      <w:r>
-        <w:t xml:space="preserve">, </w:t>
-      </w:r>
-      <w:proofErr w:type="spellStart"/>
-      <w:r>
-        <w:rPr>
-          <w:rStyle w:val="HTMLCode"/>
-        </w:rPr>
-        <w:t>git</w:t>
-      </w:r>
-      <w:proofErr w:type="spellEnd"/>
-      <w:r>
-        <w:rPr>
-          <w:rStyle w:val="HTMLCode"/>
-        </w:rPr>
-        <w:t xml:space="preserve"> blame</w:t>
-      </w:r>
-      <w:r>
-        <w:t xml:space="preserve">, and </w:t>
-      </w:r>
-      <w:proofErr w:type="spellStart"/>
-      <w:r>
-        <w:rPr>
-          <w:rStyle w:val="HTMLCode"/>
-        </w:rPr>
-        <w:t>git</w:t>
-      </w:r>
-      <w:proofErr w:type="spellEnd"/>
-      <w:r>
-        <w:rPr>
-          <w:rStyle w:val="HTMLCode"/>
-        </w:rPr>
-        <w:t xml:space="preserve"> bisect</w:t>
-      </w:r>
-      <w:r>
-        <w:t>.</w:t>
-      </w:r>
-    </w:p>
-    <w:p>
-      <w:pPr>
-        <w:pStyle w:val="NormalWeb"/>
-      </w:pPr>
-      <w:proofErr w:type="gramStart"/>
-      <w:r>
-        <w:rPr>
-          <w:rFonts w:hAnsi="Symbol"/>
-        </w:rPr>
-        <w:t></w:t>
-      </w:r>
-      <w:r>
-        <w:t xml:space="preserve">  Enables</w:t>
-      </w:r>
-      <w:proofErr w:type="gramEnd"/>
-      <w:r>
-        <w:t xml:space="preserve"> automated changelog generation and structured release tracking.</w:t>
-      </w:r>
-    </w:p>
-    <w:p>
-      <w:pPr>
-        <w:pStyle w:val="NormalWeb"/>
-      </w:pPr>
-      <w:r>
-        <w:t>Q10. What problems did you encounter during this assignment and how did you solve them?</w:t>
-      </w:r>
-    </w:p>
-    <w:p>
-      <w:pPr>
-        <w:pStyle w:val="NormalWeb"/>
-      </w:pPr>
-      <w:r>
-        <w:lastRenderedPageBreak/>
         <w:t xml:space="preserve">Answer: </w:t>
       </w:r>
       <w:proofErr w:type="gramStart"/>
@@ -11290,7 +11285,7 @@
       <w:pPr>
         <w:spacing w:after="0"/>
         <w:sectPr>
-          <w:footerReference w:type="default" r:id="rId42"/>
+          <w:footerReference w:type="default" r:id="rId43"/>
           <w:pgSz w:w="12240" w:h="15840"/>
           <w:pgMar w:top="720" w:right="720" w:bottom="720" w:left="720" w:header="720" w:footer="720" w:gutter="0"/>
           <w:cols w:space="720"/>
@@ -11527,6 +11522,7 @@
         <w:spacing w:after="0"/>
       </w:pPr>
       <w:r>
+        <w:lastRenderedPageBreak/>
         <w:t>☐ Screenshots have captions and explanations</w:t>
       </w:r>
     </w:p>
@@ -25776,7 +25772,7 @@
 </file>
 
 <file path=customXml/itemProps1.xml><?xml version="1.0" encoding="utf-8"?>
-<ds:datastoreItem xmlns:ds="http://schemas.openxmlformats.org/officeDocument/2006/customXml" ds:itemID="{F1865A1D-05D7-4DEB-8B99-2CAFBF241A36}">
+<ds:datastoreItem xmlns:ds="http://schemas.openxmlformats.org/officeDocument/2006/customXml" ds:itemID="{D2E041A8-FA4A-4998-92D7-68D20E924EB9}">
   <ds:schemaRefs>
     <ds:schemaRef ds:uri="http://schemas.openxmlformats.org/officeDocument/2006/bibliography"/>
   </ds:schemaRefs>

</xml_diff>